<commit_message>
Complete editorial dashboard and editable homepage for handoff
</commit_message>
<xml_diff>
--- a/uploads/documents/prometey-admin-guide.docx
+++ b/uploads/documents/prometey-admin-guide.docx
@@ -18,12 +18,12 @@
         <w:rPr>
           <w:sz w:val="20"/>
         </w:rPr>
-        <w:t>Памятка редактору · 24 сентября 2026 года</w:t>
+        <w:t>Памятка редактору · 13 октября 2026 года</w:t>
       </w:r>
     </w:p>
     <w:p>
       <w:r>
-        <w:t xml:space="preserve">Эта инструкция объясняет, как опубликовать задолженность у выбранного дома, исправить сумму или снять отметку, а также обновить новости, документы и контакты. Все изменения сохраняются через </w:t>
+        <w:t xml:space="preserve">Через редактор можно менять тексты главной страницы и фотоальбом, задолженность на карте, новости, документы и сведения правления. Сохранение выполняется в </w:t>
       </w:r>
       <w:r>
         <w:rPr>
@@ -32,7 +32,7 @@
         <w:t>Pages CMS</w:t>
       </w:r>
       <w:r>
-        <w:t xml:space="preserve"> — редактор сайта в браузере. После публикации их видят все посетители.</w:t>
+        <w:t>. Страница управления на самом сайте помогает выбрать задачу и проверить опубликованные данные.</w:t>
       </w:r>
     </w:p>
     <w:p>
@@ -40,7 +40,7 @@
         <w:pStyle w:val="Heading1"/>
       </w:pPr>
       <w:r>
-        <w:t>1 Вход в редактор</w:t>
+        <w:t>1 Вход и первые действия</w:t>
       </w:r>
     </w:p>
     <w:p>
@@ -53,7 +53,7 @@
             <w:color w:val="24534B"/>
             <w:u w:val="single"/>
           </w:rPr>
-          <w:t>страницу управления сайтом</w:t>
+          <w:t>Управление сайтом</w:t>
         </w:r>
       </w:hyperlink>
       <w:r>
@@ -63,10 +63,10 @@
         <w:rPr>
           <w:b/>
         </w:rPr>
-        <w:t>«Открыть редактор»</w:t>
+        <w:t>«Войти в редактор»</w:t>
       </w:r>
       <w:r>
-        <w:t xml:space="preserve">. Можно сразу перейти в </w:t>
+        <w:t xml:space="preserve">. Ссылка на управление также находится внизу сайта. Можно сразу открыть </w:t>
       </w:r>
       <w:hyperlink r:id="rId12">
         <w:r>
@@ -87,7 +87,13 @@
         <w:ind w:left="259" w:hanging="216"/>
       </w:pPr>
       <w:r>
-        <w:t>Владелец входит через GitHub под своим аккаунтом с доступом к проекту.</w:t>
+        <w:rPr>
+          <w:b/>
+        </w:rPr>
+        <w:t>Владелец</w:t>
+      </w:r>
+      <w:r>
+        <w:t xml:space="preserve"> входит через GitHub с доступом к проекту.</w:t>
       </w:r>
     </w:p>
     <w:p>
@@ -96,7 +102,13 @@
         <w:ind w:left="259" w:hanging="216"/>
       </w:pPr>
       <w:r>
-        <w:t>Приглашённый редактор входит с той почтой, на которую получил приглашение. Отдельный аккаунт GitHub ему не нужен.</w:t>
+        <w:rPr>
+          <w:b/>
+        </w:rPr>
+        <w:t>Редактор</w:t>
+      </w:r>
+      <w:r>
+        <w:t xml:space="preserve"> входит с почтой, на которую получил персональное приглашение. Аккаунт GitHub ему не нужен.</w:t>
       </w:r>
     </w:p>
     <w:p>
@@ -105,21 +117,12 @@
         <w:ind w:left="259" w:hanging="216"/>
       </w:pPr>
       <w:r>
-        <w:t xml:space="preserve">Если доступа нет, его выдаёт владелец через </w:t>
-      </w:r>
-      <w:r>
-        <w:rPr>
-          <w:b/>
-        </w:rPr>
-        <w:t>Collaborators → Invite a collaborator</w:t>
-      </w:r>
-      <w:r>
-        <w:t>. Наличие ссылки само по себе не даёт права редактирования.</w:t>
+        <w:t>Если приглашения нет, запросите его у владельца. Ссылка на управление сама по себе не даёт права менять сайт.</w:t>
       </w:r>
     </w:p>
     <w:p>
       <w:r>
-        <w:t xml:space="preserve">Если редактор предлагает выбрать проект и ветку, укажите </w:t>
+        <w:t xml:space="preserve">Если требуется выбрать проект, укажите </w:t>
       </w:r>
       <w:r>
         <w:rPr>
@@ -128,7 +131,7 @@
         <w:t>tim15071/prometey-demo</w:t>
       </w:r>
       <w:r>
-        <w:t xml:space="preserve"> и </w:t>
+        <w:t xml:space="preserve">, ветку </w:t>
       </w:r>
       <w:r>
         <w:rPr>
@@ -137,18 +140,65 @@
         <w:t>codex/demo</w:t>
       </w:r>
       <w:r>
-        <w:t>. Именно эта ветка используется действующей публикацией сайта.</w:t>
+        <w:t>. Страница управления общедоступна; её поиск дома и кнопки проверки не сохраняют изменения. Кнопки редактирования открывают отдельную вкладку Pages CMS.</w:t>
       </w:r>
     </w:p>
     <w:p>
+      <w:pPr>
+        <w:pStyle w:val="Heading2"/>
+      </w:pPr>
+      <w:r>
+        <w:t>С чего начать</w:t>
+      </w:r>
+    </w:p>
+    <w:p>
+      <w:pPr>
+        <w:ind w:left="288" w:hanging="288"/>
+      </w:pPr>
+      <w:r>
+        <w:t>1. Владелец выдаёт редактору персональный доступ. Приглашение заказчику пока не отправлено: почта будет предоставлена отдельно.</w:t>
+      </w:r>
+    </w:p>
+    <w:p>
+      <w:pPr>
+        <w:ind w:left="288" w:hanging="288"/>
+      </w:pPr>
+      <w:r>
+        <w:t xml:space="preserve">2. Заполните </w:t>
+      </w:r>
       <w:r>
         <w:rPr>
           <w:b/>
         </w:rPr>
-        <w:t>Страница «Управление» на самом сайте только показывает опубликованные данные.</w:t>
+        <w:t>«Контакты и правление»</w:t>
       </w:r>
       <w:r>
-        <w:t xml:space="preserve"> Поиск и выбор дома на ней не меняют задолженность. Запись выполняется в Pages CMS после нажатия </w:t>
+        <w:t>: телефон, почту, место и часы приёма, состав правления, описание товарищества.</w:t>
+      </w:r>
+    </w:p>
+    <w:p>
+      <w:pPr>
+        <w:ind w:left="288" w:hanging="288"/>
+      </w:pPr>
+      <w:r>
+        <w:t xml:space="preserve">3. Сверьте </w:t>
+      </w:r>
+      <w:r>
+        <w:rPr>
+          <w:b/>
+        </w:rPr>
+        <w:t>«Взносы и реквизиты»</w:t>
+      </w:r>
+      <w:r>
+        <w:t xml:space="preserve"> с официальными данными. Включайте показ реквизитов только после проверки.</w:t>
+      </w:r>
+    </w:p>
+    <w:p>
+      <w:pPr>
+        <w:ind w:left="288" w:hanging="288"/>
+      </w:pPr>
+      <w:r>
+        <w:t xml:space="preserve">4. Обновите нужные материалы, нажмите </w:t>
       </w:r>
       <w:r>
         <w:rPr>
@@ -157,105 +207,101 @@
         <w:t>Save</w:t>
       </w:r>
       <w:r>
-        <w:t xml:space="preserve"> — «Сохранить».</w:t>
+        <w:t xml:space="preserve"> и проверьте результат после завершения публикации.</w:t>
       </w:r>
     </w:p>
     <w:p>
       <w:pPr>
-        <w:pStyle w:val="Heading1"/>
+        <w:pStyle w:val="Heading2"/>
       </w:pPr>
       <w:r>
-        <w:t>Быстрый порядок для задолженности</w:t>
+        <w:t>Где искать нужную задачу</w:t>
       </w:r>
     </w:p>
     <w:p>
-      <w:pPr>
-        <w:ind w:left="288" w:hanging="288"/>
-      </w:pPr>
       <w:r>
-        <w:t xml:space="preserve">1. В Pages CMS откройте </w:t>
+        <w:t xml:space="preserve">В редакторе девять разделов: </w:t>
       </w:r>
       <w:r>
         <w:rPr>
           <w:b/>
         </w:rPr>
-        <w:t>«Карта и задолженность»</w:t>
+        <w:t>Карта и задолженность</w:t>
       </w:r>
       <w:r>
-        <w:t>.</w:t>
-      </w:r>
-    </w:p>
-    <w:p>
-      <w:pPr>
-        <w:ind w:left="288" w:hanging="288"/>
-      </w:pPr>
-      <w:r>
-        <w:t xml:space="preserve">2. В списке </w:t>
+        <w:t xml:space="preserve">, </w:t>
       </w:r>
       <w:r>
         <w:rPr>
           <w:b/>
         </w:rPr>
-        <w:t>«Задолженность»</w:t>
+        <w:t>Главная страница и фотоальбом</w:t>
       </w:r>
       <w:r>
-        <w:t xml:space="preserve"> добавьте запись.</w:t>
-      </w:r>
-    </w:p>
-    <w:p>
-      <w:pPr>
-        <w:ind w:left="288" w:hanging="288"/>
-      </w:pPr>
-      <w:r>
-        <w:t xml:space="preserve">3. Выберите </w:t>
+        <w:t xml:space="preserve">, </w:t>
       </w:r>
       <w:r>
         <w:rPr>
           <w:b/>
         </w:rPr>
-        <w:t>«Дом»</w:t>
+        <w:t>Новости и объявления</w:t>
       </w:r>
       <w:r>
-        <w:t xml:space="preserve">, введите </w:t>
+        <w:t xml:space="preserve">, </w:t>
       </w:r>
       <w:r>
         <w:rPr>
           <w:b/>
         </w:rPr>
-        <w:t>«Сумма задолженности, ₽»</w:t>
+        <w:t>Документы</w:t>
       </w:r>
       <w:r>
-        <w:t>.</w:t>
-      </w:r>
-    </w:p>
-    <w:p>
-      <w:pPr>
-        <w:ind w:left="288" w:hanging="288"/>
-      </w:pPr>
-      <w:r>
-        <w:t xml:space="preserve">4. Нажмите </w:t>
+        <w:t xml:space="preserve">, </w:t>
       </w:r>
       <w:r>
         <w:rPr>
           <w:b/>
         </w:rPr>
-        <w:t>Save</w:t>
+        <w:t>Собрания</w:t>
       </w:r>
       <w:r>
-        <w:t xml:space="preserve"> и дождитесь окончания сохранения.</w:t>
+        <w:t xml:space="preserve">, </w:t>
       </w:r>
-    </w:p>
-    <w:p>
-      <w:pPr>
-        <w:ind w:left="288" w:hanging="288"/>
-      </w:pPr>
       <w:r>
-        <w:t>5. Откройте сайт, проверьте красный контур, номер дома и сумму.</w:t>
+        <w:rPr>
+          <w:b/>
+        </w:rPr>
+        <w:t>Контакты и правление</w:t>
       </w:r>
-    </w:p>
-    <w:p>
       <w:r>
-        <w:t>Сама сохранённая запись о задолженности включает красную отметку. Отдельного выключателя публикации для неё нет. Подробный порядок — на следующей странице.</w:t>
+        <w:t xml:space="preserve">, </w:t>
+      </w:r>
+      <w:r>
+        <w:rPr>
+          <w:b/>
+        </w:rPr>
+        <w:t>Взносы и реквизиты</w:t>
+      </w:r>
+      <w:r>
+        <w:t xml:space="preserve">, </w:t>
+      </w:r>
+      <w:r>
+        <w:rPr>
+          <w:b/>
+        </w:rPr>
+        <w:t>Вопросы и ответы</w:t>
+      </w:r>
+      <w:r>
+        <w:t xml:space="preserve">, </w:t>
+      </w:r>
+      <w:r>
+        <w:rPr>
+          <w:b/>
+        </w:rPr>
+        <w:t>Камеры</w:t>
+      </w:r>
+      <w:r>
+        <w:t>. Фотографии и файлы документов находятся в отдельных медиатеках.</w:t>
       </w:r>
     </w:p>
     <w:p>
@@ -268,7 +314,7 @@
         <w:pStyle w:val="Heading1"/>
       </w:pPr>
       <w:r>
-        <w:t>2 Добавить или изменить задолженность</w:t>
+        <w:t>2 Отметить задолженность на карте</w:t>
       </w:r>
     </w:p>
     <w:p>
@@ -276,7 +322,7 @@
         <w:pStyle w:val="Heading2"/>
       </w:pPr>
       <w:r>
-        <w:t>Добавить запись</w:t>
+        <w:t>Добавить или изменить сумму</w:t>
       </w:r>
     </w:p>
     <w:p>
@@ -284,7 +330,16 @@
         <w:ind w:left="288" w:hanging="288"/>
       </w:pPr>
       <w:r>
-        <w:t xml:space="preserve">1. Откройте раздел </w:t>
+        <w:t xml:space="preserve">1. В управлении нажмите </w:t>
+      </w:r>
+      <w:r>
+        <w:rPr>
+          <w:b/>
+        </w:rPr>
+        <w:t>«Изменить задолженность»</w:t>
+      </w:r>
+      <w:r>
+        <w:t xml:space="preserve"> или откройте </w:t>
       </w:r>
       <w:r>
         <w:rPr>
@@ -293,7 +348,7 @@
         <w:t>«Карта и задолженность»</w:t>
       </w:r>
       <w:r>
-        <w:t xml:space="preserve"> в Pages CMS.</w:t>
+        <w:t xml:space="preserve"> в CMS.</w:t>
       </w:r>
     </w:p>
     <w:p>
@@ -319,7 +374,7 @@
         <w:t>Add an item</w:t>
       </w:r>
       <w:r>
-        <w:t xml:space="preserve"> — «Добавить запись».</w:t>
+        <w:t>. Для изменения существующего долга откройте его запись.</w:t>
       </w:r>
     </w:p>
     <w:p>
@@ -327,7 +382,7 @@
         <w:ind w:left="288" w:hanging="288"/>
       </w:pPr>
       <w:r>
-        <w:t xml:space="preserve">3. В поле </w:t>
+        <w:t xml:space="preserve">3. Выберите </w:t>
       </w:r>
       <w:r>
         <w:rPr>
@@ -336,16 +391,7 @@
         <w:t>«Дом»</w:t>
       </w:r>
       <w:r>
-        <w:t xml:space="preserve"> выберите нужный вариант </w:t>
-      </w:r>
-      <w:r>
-        <w:rPr>
-          <w:b/>
-        </w:rPr>
-        <w:t>«Дом № …»</w:t>
-      </w:r>
-      <w:r>
-        <w:t>. Сверяйте весь номер, включая буквы и обозначения строений. Например, номер с пометкой «с1» — отдельный вариант списка.</w:t>
+        <w:t>. Сверяйте полный номер: буква или «с1» обозначают отдельный вариант списка.</w:t>
       </w:r>
     </w:p>
     <w:p>
@@ -353,7 +399,7 @@
         <w:ind w:left="288" w:hanging="288"/>
       </w:pPr>
       <w:r>
-        <w:t xml:space="preserve">4. В поле </w:t>
+        <w:t xml:space="preserve">4. Введите </w:t>
       </w:r>
       <w:r>
         <w:rPr>
@@ -362,43 +408,7 @@
         <w:t>«Сумма задолженности, ₽»</w:t>
       </w:r>
       <w:r>
-        <w:t xml:space="preserve"> введите подтверждённую сумму в рублях. Нужна положительная сумма, максимум с двумя знаками после десятичного разделителя.</w:t>
-      </w:r>
-    </w:p>
-    <w:p>
-      <w:pPr>
-        <w:ind w:left="288" w:hanging="288"/>
-      </w:pPr>
-      <w:r>
-        <w:t>5. Проверьте дом и сумму. Один дом должен встречаться в списке задолженности один раз.</w:t>
-      </w:r>
-    </w:p>
-    <w:p>
-      <w:pPr>
-        <w:ind w:left="288" w:hanging="288"/>
-      </w:pPr>
-      <w:r>
-        <w:t xml:space="preserve">6. Нажмите </w:t>
-      </w:r>
-      <w:r>
-        <w:rPr>
-          <w:b/>
-        </w:rPr>
-        <w:t>Save</w:t>
-      </w:r>
-      <w:r>
-        <w:t xml:space="preserve"> и дождитесь подтверждения сохранения. Затем проверьте публичную карту по инструкции на странице 3.</w:t>
-      </w:r>
-    </w:p>
-    <w:p>
-      <w:r>
-        <w:rPr>
-          <w:b/>
-        </w:rPr>
-        <w:t>Формат суммы.</w:t>
-      </w:r>
-      <w:r>
-        <w:t xml:space="preserve"> Вводите только число: </w:t>
+        <w:t xml:space="preserve">: положительное число, максимум два знака после десятичного разделителя. Например, </w:t>
       </w:r>
       <w:r>
         <w:rPr>
@@ -408,7 +418,7 @@
         <w:t>12500</w:t>
       </w:r>
       <w:r>
-        <w:t xml:space="preserve"> для 12 500 рублей или </w:t>
+        <w:t xml:space="preserve"> или </w:t>
       </w:r>
       <w:r>
         <w:rPr>
@@ -418,44 +428,24 @@
         <w:t>12500.50</w:t>
       </w:r>
       <w:r>
-        <w:t xml:space="preserve"> для 12 500 рублей 50 копеек. Не добавляйте пробелы, слово «рублей» или знак ₽. В файле данных поле называется </w:t>
-      </w:r>
-      <w:r>
-        <w:rPr>
-          <w:rFonts w:ascii="Consolas" w:hAnsi="Consolas"/>
-          <w:sz w:val="21"/>
-        </w:rPr>
-        <w:t>amountRub</w:t>
-      </w:r>
-      <w:r>
-        <w:t>, а десятичный разделитель — точка. Это примеры формата, не сведения о долге какого-либо дома.</w:t>
-      </w:r>
-    </w:p>
-    <w:p>
-      <w:r>
-        <w:t>Сумма появится на сайте в карточке выбранного дома. Красный контур показывает, что для этого дома опубликована запись о задолженности. Запись не выполняет бухгалтерских расчётов и не проверяет факт оплаты автоматически.</w:t>
+        <w:t>. Это примеры формата, а не сведения о конкретном доме.</w:t>
       </w:r>
     </w:p>
     <w:p>
       <w:pPr>
-        <w:pStyle w:val="Heading2"/>
+        <w:ind w:left="288" w:hanging="288"/>
       </w:pPr>
       <w:r>
-        <w:t>Исправить сумму или выбранный дом</w:t>
-      </w:r>
-    </w:p>
-    <w:p>
-      <w:r>
-        <w:t xml:space="preserve">Откройте существующую запись в </w:t>
+        <w:t xml:space="preserve">5. Проверьте дом и сумму. </w:t>
       </w:r>
       <w:r>
         <w:rPr>
           <w:b/>
         </w:rPr>
-        <w:t>«Задолженность»</w:t>
+        <w:t>Один дом должен встречаться в списке один раз.</w:t>
       </w:r>
       <w:r>
-        <w:t xml:space="preserve">, измените сумму либо выбор дома и нажмите </w:t>
+        <w:t xml:space="preserve"> Нажмите </w:t>
       </w:r>
       <w:r>
         <w:rPr>
@@ -464,7 +454,12 @@
         <w:t>Save</w:t>
       </w:r>
       <w:r>
-        <w:t>. Новую запись для того же дома создавать не нужно. После публикации проверьте правильный дом и, если меняли номер, убедитесь, что прежний больше не отмечен по ошибке.</w:t>
+        <w:t xml:space="preserve"> и дождитесь окончания сохранения.</w:t>
+      </w:r>
+    </w:p>
+    <w:p>
+      <w:r>
+        <w:t>Для задолженности нет отдельного выключателя публикации. Сохранённая запись с суммой включает красную отметку и показывает сумму всем посетителям. Приложение не рассчитывает долг и не сверяет оплату автоматически.</w:t>
       </w:r>
     </w:p>
     <w:p>
@@ -472,12 +467,12 @@
         <w:pStyle w:val="Heading2"/>
       </w:pPr>
       <w:r>
-        <w:t>Снять задолженность</w:t>
+        <w:t>Снять отметку после оплаты</w:t>
       </w:r>
     </w:p>
     <w:p>
       <w:r>
-        <w:t xml:space="preserve">Удалите соответствующую запись из списка: нажмите корзину, подтвердите </w:t>
+        <w:t xml:space="preserve">Удалите всю запись нужного дома: корзина → </w:t>
       </w:r>
       <w:r>
         <w:rPr>
@@ -486,7 +481,7 @@
         <w:t>Remove</w:t>
       </w:r>
       <w:r>
-        <w:t xml:space="preserve">, затем </w:t>
+        <w:t xml:space="preserve"> → </w:t>
       </w:r>
       <w:r>
         <w:rPr>
@@ -495,30 +490,79 @@
         <w:t>Save</w:t>
       </w:r>
       <w:r>
-        <w:t xml:space="preserve">. После публикации красная отметка и сумма этого дома исчезнут. </w:t>
+        <w:t>. Нулевую сумму вводить не нужно. После публикации проверьте, что красная отметка и сумма исчезли. Если меняли дом в записи, дополнительно проверьте прежний номер.</w:t>
+      </w:r>
+    </w:p>
+    <w:p>
+      <w:pPr>
+        <w:pStyle w:val="Heading2"/>
+      </w:pPr>
+      <w:r>
+        <w:t>Проверить результат</w:t>
+      </w:r>
+    </w:p>
+    <w:p>
+      <w:r>
+        <w:t xml:space="preserve">В управлении найдите дом по номеру и выберите его в </w:t>
       </w:r>
       <w:r>
         <w:rPr>
           <w:b/>
         </w:rPr>
-        <w:t>Нулевую сумму вводить не нужно</w:t>
+        <w:t>«Дом на карте»</w:t>
       </w:r>
       <w:r>
-        <w:t xml:space="preserve"> — для снятия задолженности удаляется запись.</w:t>
-      </w:r>
-    </w:p>
-    <w:p>
-      <w:r>
-        <w:t xml:space="preserve">В старых данных может встречаться отметка </w:t>
+        <w:t xml:space="preserve">. Нажмите </w:t>
       </w:r>
       <w:r>
         <w:rPr>
           <w:b/>
         </w:rPr>
-        <w:t>«Сумма не указана»</w:t>
+        <w:t>«Проверить публикацию»</w:t>
       </w:r>
       <w:r>
-        <w:t>. Передайте такой случай владельцу для переноса данных: текущая форма предназначена для записей с суммой, а прежний список скрыт. Наличие старой отметки не добавляет сумму автоматически.</w:t>
+        <w:t xml:space="preserve">, затем </w:t>
+      </w:r>
+      <w:r>
+        <w:rPr>
+          <w:b/>
+        </w:rPr>
+        <w:t>«Посмотреть на карте»</w:t>
+      </w:r>
+      <w:r>
+        <w:t>. Проверьте положение, полный номер и сумму. Ссылку на выбранный дом можно скопировать и открыть на телефоне.</w:t>
+      </w:r>
+    </w:p>
+    <w:p>
+      <w:r>
+        <w:t>Если обновление ещё не видно, дождитесь успешной публикации GitHub Pages и обновите страницу. Ошибка загрузки данных не подтверждает снятие задолженности. Не создавайте дубликаты записей для ускорения обновления.</w:t>
+      </w:r>
+    </w:p>
+    <w:p>
+      <w:pPr>
+        <w:pStyle w:val="Heading2"/>
+      </w:pPr>
+      <w:r>
+        <w:t>Если номера нет или он указан неверно</w:t>
+      </w:r>
+    </w:p>
+    <w:p>
+      <w:r>
+        <w:t xml:space="preserve">Не выбирайте соседний дом. Передайте владельцу точное положение и подтверждение номера. Группа </w:t>
+      </w:r>
+      <w:r>
+        <w:rPr>
+          <w:b/>
+        </w:rPr>
+        <w:t>«Уточнить или добавить номер»</w:t>
+      </w:r>
+      <w:r>
+        <w:t xml:space="preserve"> меняет подпись существующего контура, но не создаёт новое здание. После уточнения подпись в списке CMS может оставаться исходной: сверяйте положение на карте.</w:t>
+      </w:r>
+    </w:p>
+    <w:p>
+      <w:r>
+        <w:t>В реестре 205 зданий: 202 номера из OpenStreetMap и 3 уточнения по Яндекс Картам. Это контуры строений, а не кадастровые границы участков. Полная сверка всех номеров с Яндекс Картами не заявляется.</w:t>
       </w:r>
     </w:p>
     <w:p>
@@ -531,15 +575,21 @@
         <w:pStyle w:val="Heading1"/>
       </w:pPr>
       <w:r>
-        <w:t>3 Проверить публикацию на карте</w:t>
+        <w:t>3 Изменить главную страницу и фотоальбом</w:t>
       </w:r>
     </w:p>
     <w:p>
-      <w:pPr>
-        <w:ind w:left="288" w:hanging="288"/>
-      </w:pPr>
       <w:r>
-        <w:t xml:space="preserve">1. После </w:t>
+        <w:t xml:space="preserve">Откройте </w:t>
+      </w:r>
+      <w:r>
+        <w:rPr>
+          <w:b/>
+        </w:rPr>
+        <w:t>«Главная страница и фотоальбом»</w:t>
+      </w:r>
+      <w:r>
+        <w:t xml:space="preserve">. После изменений в этом разделе нажмите </w:t>
       </w:r>
       <w:r>
         <w:rPr>
@@ -548,19 +598,42 @@
         <w:t>Save</w:t>
       </w:r>
       <w:r>
-        <w:t xml:space="preserve"> откройте </w:t>
+        <w:t xml:space="preserve"> один раз для сохранения всей формы.</w:t>
       </w:r>
-      <w:hyperlink r:id="rId11">
-        <w:r>
-          <w:rPr>
-            <w:color w:val="24534B"/>
-            <w:u w:val="single"/>
-          </w:rPr>
-          <w:t>страницу управления</w:t>
-        </w:r>
-      </w:hyperlink>
+    </w:p>
+    <w:p>
+      <w:pPr>
+        <w:pStyle w:val="Heading2"/>
+      </w:pPr>
       <w:r>
-        <w:t>. Публикация обычно занимает 1–3 минуты; время зависит от сервиса.</w:t>
+        <w:t>Тексты пролёта</w:t>
+      </w:r>
+    </w:p>
+    <w:p>
+      <w:r>
+        <w:t xml:space="preserve">В группе </w:t>
+      </w:r>
+      <w:r>
+        <w:rPr>
+          <w:b/>
+        </w:rPr>
+        <w:t>«Тексты пролёта»</w:t>
+      </w:r>
+      <w:r>
+        <w:t xml:space="preserve"> находятся три сцены. В каждой можно изменить надпись над заголовком, две строки заголовка и описание. На каждую строку заголовка допускается до 32 символов. Короткие фразы лучше читаются на телефоне; длинные описания проверьте поверх пейзажа.</w:t>
+      </w:r>
+    </w:p>
+    <w:p>
+      <w:r>
+        <w:t>Сам фильм, траектория и поведение пролёта при прокрутке остаются частью программного оформления. Замена текстов не изменяет движение камеры.</w:t>
+      </w:r>
+    </w:p>
+    <w:p>
+      <w:pPr>
+        <w:pStyle w:val="Heading2"/>
+      </w:pPr>
+      <w:r>
+        <w:t>Добавить фотографию</w:t>
       </w:r>
     </w:p>
     <w:p>
@@ -568,22 +641,22 @@
         <w:ind w:left="288" w:hanging="288"/>
       </w:pPr>
       <w:r>
-        <w:t xml:space="preserve">2. В блоке карты введите номер в </w:t>
+        <w:t xml:space="preserve">1. В группе </w:t>
       </w:r>
       <w:r>
         <w:rPr>
           <w:b/>
         </w:rPr>
-        <w:t>«Найти дом по номеру»</w:t>
+        <w:t>«Фотоальбом» → «Фотографии и порядок»</w:t>
       </w:r>
       <w:r>
-        <w:t xml:space="preserve">, затем выберите его в поле </w:t>
+        <w:t xml:space="preserve"> нажмите </w:t>
       </w:r>
       <w:r>
         <w:rPr>
           <w:b/>
         </w:rPr>
-        <w:t>«Дом на карте»</w:t>
+        <w:t>Add an item</w:t>
       </w:r>
       <w:r>
         <w:t>.</w:t>
@@ -594,25 +667,16 @@
         <w:ind w:left="288" w:hanging="288"/>
       </w:pPr>
       <w:r>
-        <w:t xml:space="preserve">3. Нажмите </w:t>
+        <w:t xml:space="preserve">2. Выберите готовую фотографию Прометея либо загрузите свою в поле </w:t>
       </w:r>
       <w:r>
         <w:rPr>
           <w:b/>
         </w:rPr>
-        <w:t>«Проверить публикацию»</w:t>
+        <w:t>«Загрузить свою фотографию»</w:t>
       </w:r>
       <w:r>
-        <w:t xml:space="preserve">. Блок </w:t>
-      </w:r>
-      <w:r>
-        <w:rPr>
-          <w:b/>
-        </w:rPr>
-        <w:t>«Опубликовано на карте»</w:t>
-      </w:r>
-      <w:r>
-        <w:t xml:space="preserve"> должен показать актуальную отметку и сумму.</w:t>
+        <w:t>. Если заполнены оба поля, используется загруженный файл.</w:t>
       </w:r>
     </w:p>
     <w:p>
@@ -620,28 +684,34 @@
         <w:ind w:left="288" w:hanging="288"/>
       </w:pPr>
       <w:r>
-        <w:t xml:space="preserve">4. Нажмите </w:t>
+        <w:t xml:space="preserve">3. Укажите </w:t>
       </w:r>
       <w:r>
         <w:rPr>
           <w:b/>
         </w:rPr>
-        <w:t>«Посмотреть на карте»</w:t>
+        <w:t>«Название фотографии»</w:t>
       </w:r>
       <w:r>
-        <w:t xml:space="preserve">. Проверьте положение дома, полный номер, красный контур и сумму в его карточке. Прямая ссылка на карту: </w:t>
+        <w:t xml:space="preserve">, </w:t>
       </w:r>
-      <w:hyperlink r:id="rId13">
-        <w:r>
-          <w:rPr>
-            <w:color w:val="24534B"/>
-            <w:u w:val="single"/>
-          </w:rPr>
-          <w:t>карта Прометея</w:t>
-        </w:r>
-      </w:hyperlink>
       <w:r>
-        <w:t>.</w:t>
+        <w:rPr>
+          <w:b/>
+        </w:rPr>
+        <w:t>«Описание изображения»</w:t>
+      </w:r>
+      <w:r>
+        <w:t xml:space="preserve"> и, при необходимости, </w:t>
+      </w:r>
+      <w:r>
+        <w:rPr>
+          <w:b/>
+        </w:rPr>
+        <w:t>«Короткая подпись»</w:t>
+      </w:r>
+      <w:r>
+        <w:t>. Описание изображения объясняет, что на снимке, в том числе посетителю с экранным диктором.</w:t>
       </w:r>
     </w:p>
     <w:p>
@@ -649,12 +719,38 @@
         <w:ind w:left="288" w:hanging="288"/>
       </w:pPr>
       <w:r>
-        <w:t>5. Для окончательной проверки откройте сайт в другом браузере или на телефоне. Для просмотра опубликованной карты вход в Pages CMS не нужен.</w:t>
+        <w:t xml:space="preserve">4. Включите </w:t>
+      </w:r>
+      <w:r>
+        <w:rPr>
+          <w:b/>
+        </w:rPr>
+        <w:t>«Показывать в альбоме»</w:t>
+      </w:r>
+      <w:r>
+        <w:t xml:space="preserve"> и нажмите </w:t>
+      </w:r>
+      <w:r>
+        <w:rPr>
+          <w:b/>
+        </w:rPr>
+        <w:t>Save</w:t>
+      </w:r>
+      <w:r>
+        <w:t>. Новая запись по умолчанию скрыта.</w:t>
+      </w:r>
+    </w:p>
+    <w:p>
+      <w:pPr>
+        <w:ind w:left="288" w:hanging="288"/>
+      </w:pPr>
+      <w:r>
+        <w:t>5. После публикации откройте фотографию на сайте. Проверьте подпись, крупное изображение и вид на телефоне.</w:t>
       </w:r>
     </w:p>
     <w:p>
       <w:r>
-        <w:t>Если задолженность снята, проверьте исчезновение и красного контура, и суммы. Отсутствие красной отметки означает, что запись не опубликована; само по себе это не подтверждает отсутствие долга в учёте правления.</w:t>
+        <w:t>Подойдут JPG, PNG или WebP. Рекомендуется ширина 1600–2400 пикселей и размер до 2 МБ. Альбом поддерживает до 60 записей. Перетаскивайте записи, чтобы менять их порядок.</w:t>
       </w:r>
     </w:p>
     <w:p>
@@ -662,7 +758,331 @@
         <w:pStyle w:val="Heading2"/>
       </w:pPr>
       <w:r>
-        <w:t>Если результат не изменился</w:t>
+        <w:t>Убрать снимок или изменить подписи блоков</w:t>
+      </w:r>
+    </w:p>
+    <w:p>
+      <w:r>
+        <w:t xml:space="preserve">Выключите </w:t>
+      </w:r>
+      <w:r>
+        <w:rPr>
+          <w:b/>
+        </w:rPr>
+        <w:t>«Показывать в альбоме»</w:t>
+      </w:r>
+      <w:r>
+        <w:t xml:space="preserve">, чтобы скрыть снимок. Для удаления записи используйте корзину → </w:t>
+      </w:r>
+      <w:r>
+        <w:rPr>
+          <w:b/>
+        </w:rPr>
+        <w:t>Remove</w:t>
+      </w:r>
+      <w:r>
+        <w:t xml:space="preserve"> → </w:t>
+      </w:r>
+      <w:r>
+        <w:rPr>
+          <w:b/>
+        </w:rPr>
+        <w:t>Save</w:t>
+      </w:r>
+      <w:r>
+        <w:t>. Если удалить все записи, альбом останется пустым. Сам загруженный файл удаляется отдельно в медиатеке.</w:t>
+      </w:r>
+    </w:p>
+    <w:p>
+      <w:r>
+        <w:t>В этом же разделе редактируются заголовок и вступление альбома, HTTPS-ссылка на полный альбом, заголовок карты домов и текст пейзажа перед контактами. Очистите ссылку на полный альбом, чтобы скрыть её. Геометрия карты, шрифты и устройство страниц изменяются разработчиком.</w:t>
+      </w:r>
+    </w:p>
+    <w:p>
+      <w:r>
+        <w:br w:type="page"/>
+      </w:r>
+    </w:p>
+    <w:p>
+      <w:pPr>
+        <w:pStyle w:val="Heading1"/>
+      </w:pPr>
+      <w:r>
+        <w:t>4 Обновить материалы для жителей</w:t>
+      </w:r>
+    </w:p>
+    <w:p>
+      <w:pPr>
+        <w:pStyle w:val="Heading2"/>
+      </w:pPr>
+      <w:r>
+        <w:t>Новости и объявления</w:t>
+      </w:r>
+    </w:p>
+    <w:p>
+      <w:r>
+        <w:t xml:space="preserve">Нажмите </w:t>
+      </w:r>
+      <w:r>
+        <w:rPr>
+          <w:b/>
+        </w:rPr>
+        <w:t>Add an item</w:t>
+      </w:r>
+      <w:r>
+        <w:t xml:space="preserve">, заполните заголовок, дату и текст. При необходимости добавьте фотографию обложки и включите </w:t>
+      </w:r>
+      <w:r>
+        <w:rPr>
+          <w:b/>
+        </w:rPr>
+        <w:t>«Важное — показывать первым»</w:t>
+      </w:r>
+      <w:r>
+        <w:t xml:space="preserve">. Для публикации включите </w:t>
+      </w:r>
+      <w:r>
+        <w:rPr>
+          <w:b/>
+        </w:rPr>
+        <w:t>«Показывать на сайте»</w:t>
+      </w:r>
+      <w:r>
+        <w:t xml:space="preserve">, затем </w:t>
+      </w:r>
+      <w:r>
+        <w:rPr>
+          <w:b/>
+        </w:rPr>
+        <w:t>Save</w:t>
+      </w:r>
+      <w:r>
+        <w:t>.</w:t>
+      </w:r>
+    </w:p>
+    <w:p>
+      <w:r>
+        <w:t>Выключенный показ позволяет сохранить черновик. Чтобы убрать опубликованную новость из ленты, выключите этот же переключатель и сохраните. Черновики хранятся в публичном проекте и не предназначены для закрытой переписки.</w:t>
+      </w:r>
+    </w:p>
+    <w:p>
+      <w:pPr>
+        <w:pStyle w:val="Heading2"/>
+      </w:pPr>
+      <w:r>
+        <w:t>Документы и вложения</w:t>
+      </w:r>
+    </w:p>
+    <w:p>
+      <w:pPr>
+        <w:ind w:left="288" w:hanging="288"/>
+      </w:pPr>
+      <w:r>
+        <w:t xml:space="preserve">1. В </w:t>
+      </w:r>
+      <w:r>
+        <w:rPr>
+          <w:b/>
+        </w:rPr>
+        <w:t>«Документы»</w:t>
+      </w:r>
+      <w:r>
+        <w:t xml:space="preserve"> добавьте запись, укажите название, категорию, дату и пояснение.</w:t>
+      </w:r>
+    </w:p>
+    <w:p>
+      <w:pPr>
+        <w:ind w:left="288" w:hanging="288"/>
+      </w:pPr>
+      <w:r>
+        <w:t xml:space="preserve">2. В поле </w:t>
+      </w:r>
+      <w:r>
+        <w:rPr>
+          <w:b/>
+        </w:rPr>
+        <w:t>«Загрузить или выбрать файл»</w:t>
+      </w:r>
+      <w:r>
+        <w:t xml:space="preserve"> выберите существующее вложение либо загрузите новое с компьютера. Подойдут PDF, Word и таблицы; рекомендуемый размер до 10 МБ.</w:t>
+      </w:r>
+    </w:p>
+    <w:p>
+      <w:pPr>
+        <w:ind w:left="288" w:hanging="288"/>
+      </w:pPr>
+      <w:r>
+        <w:t xml:space="preserve">3. Включите </w:t>
+      </w:r>
+      <w:r>
+        <w:rPr>
+          <w:b/>
+        </w:rPr>
+        <w:t>«Показывать на сайте»</w:t>
+      </w:r>
+      <w:r>
+        <w:t xml:space="preserve">, нажмите </w:t>
+      </w:r>
+      <w:r>
+        <w:rPr>
+          <w:b/>
+        </w:rPr>
+        <w:t>Save</w:t>
+      </w:r>
+      <w:r>
+        <w:t>. На сайте откройте документ и убедитесь, что скачивается нужная версия.</w:t>
+      </w:r>
+    </w:p>
+    <w:p>
+      <w:r>
+        <w:t>Категории: «Устав», «Собрания», «Финансы», «Бланки», «Другое». Переименование карточки не заменяет файл: при обновлении документа выберите новое вложение явно.</w:t>
+      </w:r>
+    </w:p>
+    <w:p>
+      <w:pPr>
+        <w:pStyle w:val="Heading2"/>
+      </w:pPr>
+      <w:r>
+        <w:t>Контакты и правление</w:t>
+      </w:r>
+    </w:p>
+    <w:p>
+      <w:r>
+        <w:t xml:space="preserve">Измените адрес, телефон, почту, место и часы приёма, описание товарищества. В </w:t>
+      </w:r>
+      <w:r>
+        <w:rPr>
+          <w:b/>
+        </w:rPr>
+        <w:t>«Состав правления»</w:t>
+      </w:r>
+      <w:r>
+        <w:t xml:space="preserve"> задаются имя и должность. Описание товарищества выводится в блоке </w:t>
+      </w:r>
+      <w:r>
+        <w:rPr>
+          <w:b/>
+        </w:rPr>
+        <w:t>«Правление и собрания»</w:t>
+      </w:r>
+      <w:r>
+        <w:t>. Сохраните форму и проверьте разделы на сайте. Здесь нет отдельного выключателя публикации.</w:t>
+      </w:r>
+    </w:p>
+    <w:p>
+      <w:pPr>
+        <w:pStyle w:val="Heading2"/>
+      </w:pPr>
+      <w:r>
+        <w:t>Собрания вопросы и реквизиты</w:t>
+      </w:r>
+    </w:p>
+    <w:p>
+      <w:r>
+        <w:t xml:space="preserve">В </w:t>
+      </w:r>
+      <w:r>
+        <w:rPr>
+          <w:b/>
+        </w:rPr>
+        <w:t>«Собрания»</w:t>
+      </w:r>
+      <w:r>
+        <w:t xml:space="preserve"> задаются название, дата, время, место, повестка и видимость. В </w:t>
+      </w:r>
+      <w:r>
+        <w:rPr>
+          <w:b/>
+        </w:rPr>
+        <w:t>«Вопросы и ответы»</w:t>
+      </w:r>
+      <w:r>
+        <w:t xml:space="preserve"> редактируются текст, порядок и показ ответов. В </w:t>
+      </w:r>
+      <w:r>
+        <w:rPr>
+          <w:b/>
+        </w:rPr>
+        <w:t>«Взносы и реквизиты»</w:t>
+      </w:r>
+      <w:r>
+        <w:t xml:space="preserve"> — пояснения, сроки и банковские данные. Перед включением </w:t>
+      </w:r>
+      <w:r>
+        <w:rPr>
+          <w:b/>
+        </w:rPr>
+        <w:t>«Показывать реквизиты на сайте»</w:t>
+      </w:r>
+      <w:r>
+        <w:t xml:space="preserve"> сверьте получателя, ИНН, банк, БИК и расчётный счёт.</w:t>
+      </w:r>
+    </w:p>
+    <w:p>
+      <w:pPr>
+        <w:pStyle w:val="Heading2"/>
+      </w:pPr>
+      <w:r>
+        <w:t>Камеры</w:t>
+      </w:r>
+    </w:p>
+    <w:p>
+      <w:r>
+        <w:t>Раздел позволяет менять названия, описания, порядок и видимость карточек. Это не запускает видеотрансляцию. Постоянный источник видео пока не подключён; его настройка и авторизация жителей выполняются отдельно. Оставляйте поле потока пустым до согласованного подключения. Пароли, RTSP-ссылки с паролями и облачные ключи в CMS не добавляются.</w:t>
+      </w:r>
+    </w:p>
+    <w:p>
+      <w:r>
+        <w:br w:type="page"/>
+      </w:r>
+    </w:p>
+    <w:p>
+      <w:pPr>
+        <w:pStyle w:val="Heading1"/>
+      </w:pPr>
+      <w:r>
+        <w:t>5 Проверить публикацию и сохранить копию</w:t>
+      </w:r>
+    </w:p>
+    <w:p>
+      <w:pPr>
+        <w:pStyle w:val="Heading2"/>
+      </w:pPr>
+      <w:r>
+        <w:t>После каждого сохранения</w:t>
+      </w:r>
+    </w:p>
+    <w:p>
+      <w:r>
+        <w:rPr>
+          <w:b/>
+        </w:rPr>
+        <w:t>Save</w:t>
+      </w:r>
+      <w:r>
+        <w:t xml:space="preserve"> сохраняет материалы в проекте GitHub. Сайт получает новую версию после успешного завершения публикации GitHub Pages. Фиксированного времени ожидания нет: оно зависит от очереди сервиса. Затем обновите сайт и нажмите </w:t>
+      </w:r>
+      <w:r>
+        <w:rPr>
+          <w:b/>
+        </w:rPr>
+        <w:t>«Обновить данные»</w:t>
+      </w:r>
+      <w:r>
+        <w:t xml:space="preserve"> в управлении.</w:t>
+      </w:r>
+    </w:p>
+    <w:p>
+      <w:r>
+        <w:t>Проверьте конкретный результат: текст или фотографию, ссылку документа, дату новости, номер дома и сумму. Для окончательной проверки откройте страницу в другом браузере или на телефоне. Вход в редактор для просмотра публичного сайта не нужен.</w:t>
+      </w:r>
+    </w:p>
+    <w:p>
+      <w:pPr>
+        <w:pStyle w:val="Heading2"/>
+      </w:pPr>
+      <w:r>
+        <w:t>Если изменение не появилось</w:t>
       </w:r>
     </w:p>
     <w:p>
@@ -671,16 +1091,7 @@
         <w:ind w:left="259" w:hanging="216"/>
       </w:pPr>
       <w:r>
-        <w:t xml:space="preserve">Убедитесь, что сохранение завершилось, а открыты проект </w:t>
-      </w:r>
-      <w:r>
-        <w:rPr>
-          <w:b/>
-        </w:rPr>
-        <w:t>tim15071/prometey-demo</w:t>
-      </w:r>
-      <w:r>
-        <w:t xml:space="preserve"> и ветка </w:t>
+        <w:t xml:space="preserve">Повторно откройте запись в CMS и убедитесь, что она сохранилась. Проверьте проект и ветку </w:t>
       </w:r>
       <w:r>
         <w:rPr>
@@ -698,16 +1109,7 @@
         <w:ind w:left="259" w:hanging="216"/>
       </w:pPr>
       <w:r>
-        <w:t xml:space="preserve">Подождите несколько минут, обновите страницу сайта и снова нажмите </w:t>
-      </w:r>
-      <w:r>
-        <w:rPr>
-          <w:b/>
-        </w:rPr>
-        <w:t>«Проверить публикацию»</w:t>
-      </w:r>
-      <w:r>
-        <w:t>.</w:t>
+        <w:t>Проверьте переключатель видимости, если он есть у этого типа записи.</w:t>
       </w:r>
     </w:p>
     <w:p>
@@ -716,7 +1118,19 @@
         <w:ind w:left="259" w:hanging="216"/>
       </w:pPr>
       <w:r>
-        <w:t>Повторно откройте запись в CMS и проверьте, сохранились ли изменения. Не добавляйте дубликат в попытке ускорить публикацию.</w:t>
+        <w:t xml:space="preserve">Владелец может проверить </w:t>
+      </w:r>
+      <w:hyperlink r:id="rId13">
+        <w:r>
+          <w:rPr>
+            <w:color w:val="24534B"/>
+            <w:u w:val="single"/>
+          </w:rPr>
+          <w:t>публикации GitHub Pages</w:t>
+        </w:r>
+      </w:hyperlink>
+      <w:r>
+        <w:t>. Если публикация завершилась ошибкой, передайте ему время изменения и название раздела.</w:t>
       </w:r>
     </w:p>
     <w:p>
@@ -725,168 +1139,7 @@
         <w:ind w:left="259" w:hanging="216"/>
       </w:pPr>
       <w:r>
-        <w:t>Если раздел сообщает об ошибке загрузки, это не подтверждение снятия задолженности. Передайте владельцу номер дома, время сохранения и текст ошибки.</w:t>
-      </w:r>
-    </w:p>
-    <w:p>
-      <w:pPr>
-        <w:pStyle w:val="Heading2"/>
-      </w:pPr>
-      <w:r>
-        <w:t>Что охватывает карта</w:t>
-      </w:r>
-    </w:p>
-    <w:p>
-      <w:r>
-        <w:t xml:space="preserve">На схеме </w:t>
-      </w:r>
-      <w:r>
-        <w:rPr>
-          <w:b/>
-        </w:rPr>
-        <w:t>205 зданий текущего реестра</w:t>
-      </w:r>
-      <w:r>
-        <w:t>: 202 номера из OpenStreetMap и 3 уточнения по Яндекс Картам. Записи связаны с контурами строений. Это не кадастровые границы участков, не сплошная сверка с Яндекс Картами и не подтверждение полноты всех домов СНТ.</w:t>
-      </w:r>
-    </w:p>
-    <w:p>
-      <w:r>
-        <w:t xml:space="preserve">Если нужного номера нет, не выбирайте соседний дом. Передайте владельцу точное положение и подтверждение номера. В группе </w:t>
-      </w:r>
-      <w:r>
-        <w:rPr>
-          <w:b/>
-        </w:rPr>
-        <w:t>«Уточнить или добавить номер»</w:t>
-      </w:r>
-      <w:r>
-        <w:t xml:space="preserve"> можно изменить подпись существующего контура; новый контур через эту форму не создаётся. В списках CMS после такого уточнения может оставаться исходная подпись дома, поэтому сначала сверьте его положение на карте.</w:t>
-      </w:r>
-    </w:p>
-    <w:p>
-      <w:r>
-        <w:br w:type="page"/>
-      </w:r>
-    </w:p>
-    <w:p>
-      <w:pPr>
-        <w:pStyle w:val="Heading1"/>
-      </w:pPr>
-      <w:r>
-        <w:t>4 Новости документы и контакты</w:t>
-      </w:r>
-    </w:p>
-    <w:p>
-      <w:pPr>
-        <w:pStyle w:val="Heading2"/>
-      </w:pPr>
-      <w:r>
-        <w:t>Опубликовать новость</w:t>
-      </w:r>
-    </w:p>
-    <w:p>
-      <w:pPr>
-        <w:ind w:left="288" w:hanging="288"/>
-      </w:pPr>
-      <w:r>
-        <w:t xml:space="preserve">1. Откройте </w:t>
-      </w:r>
-      <w:r>
-        <w:rPr>
-          <w:b/>
-        </w:rPr>
-        <w:t>«Новости и объявления»</w:t>
-      </w:r>
-      <w:r>
-        <w:t xml:space="preserve">, нажмите </w:t>
-      </w:r>
-      <w:r>
-        <w:rPr>
-          <w:b/>
-        </w:rPr>
-        <w:t>Add an item</w:t>
-      </w:r>
-      <w:r>
-        <w:t>.</w:t>
-      </w:r>
-    </w:p>
-    <w:p>
-      <w:pPr>
-        <w:ind w:left="288" w:hanging="288"/>
-      </w:pPr>
-      <w:r>
-        <w:t xml:space="preserve">2. Заполните </w:t>
-      </w:r>
-      <w:r>
-        <w:rPr>
-          <w:b/>
-        </w:rPr>
-        <w:t>«Заголовок»</w:t>
-      </w:r>
-      <w:r>
-        <w:t xml:space="preserve">, </w:t>
-      </w:r>
-      <w:r>
-        <w:rPr>
-          <w:b/>
-        </w:rPr>
-        <w:t>«Дата публикации»</w:t>
-      </w:r>
-      <w:r>
-        <w:t xml:space="preserve"> и </w:t>
-      </w:r>
-      <w:r>
-        <w:rPr>
-          <w:b/>
-        </w:rPr>
-        <w:t>«Текст новости»</w:t>
-      </w:r>
-      <w:r>
-        <w:t xml:space="preserve">. При необходимости добавьте </w:t>
-      </w:r>
-      <w:r>
-        <w:rPr>
-          <w:b/>
-        </w:rPr>
-        <w:t>«Фотография обложки»</w:t>
-      </w:r>
-      <w:r>
-        <w:t>.</w:t>
-      </w:r>
-    </w:p>
-    <w:p>
-      <w:pPr>
-        <w:ind w:left="288" w:hanging="288"/>
-      </w:pPr>
-      <w:r>
-        <w:t xml:space="preserve">3. Для важного сообщения включите </w:t>
-      </w:r>
-      <w:r>
-        <w:rPr>
-          <w:b/>
-        </w:rPr>
-        <w:t>«Важное — показывать первым»</w:t>
-      </w:r>
-      <w:r>
-        <w:t>.</w:t>
-      </w:r>
-    </w:p>
-    <w:p>
-      <w:pPr>
-        <w:ind w:left="288" w:hanging="288"/>
-      </w:pPr>
-      <w:r>
-        <w:t xml:space="preserve">4. Включите </w:t>
-      </w:r>
-      <w:r>
-        <w:rPr>
-          <w:b/>
-        </w:rPr>
-        <w:t>«Показывать на сайте»</w:t>
-      </w:r>
-      <w:r>
-        <w:t xml:space="preserve"> и нажмите </w:t>
+        <w:t xml:space="preserve">Если CMS не принимает данные, проверьте обязательные поля и ограничения. Если после сохранения следующее изменение не активировало </w:t>
       </w:r>
       <w:r>
         <w:rPr>
@@ -895,47 +1148,7 @@
         <w:t>Save</w:t>
       </w:r>
       <w:r>
-        <w:t>.</w:t>
-      </w:r>
-    </w:p>
-    <w:p>
-      <w:pPr>
-        <w:ind w:left="288" w:hanging="288"/>
-      </w:pPr>
-      <w:r>
-        <w:t>5. После обновления публикации откройте новость на сайте и проверьте текст, дату и фотографию.</w:t>
-      </w:r>
-    </w:p>
-    <w:p>
-      <w:r>
-        <w:t xml:space="preserve">Чтобы убрать новость из ленты, выключите </w:t>
-      </w:r>
-      <w:r>
-        <w:rPr>
-          <w:b/>
-        </w:rPr>
-        <w:t>«Показывать на сайте»</w:t>
-      </w:r>
-      <w:r>
-        <w:t xml:space="preserve"> и сохраните. Для удаления записи используйте корзину → </w:t>
-      </w:r>
-      <w:r>
-        <w:rPr>
-          <w:b/>
-        </w:rPr>
-        <w:t>Remove</w:t>
-      </w:r>
-      <w:r>
-        <w:t xml:space="preserve"> → </w:t>
-      </w:r>
-      <w:r>
-        <w:rPr>
-          <w:b/>
-        </w:rPr>
-        <w:t>Save</w:t>
-      </w:r>
-      <w:r>
-        <w:t>.</w:t>
+        <w:t>, обновите форму и повторите действие. Несохранённый текст предварительно скопируйте.</w:t>
       </w:r>
     </w:p>
     <w:p>
@@ -943,110 +1156,35 @@
         <w:pStyle w:val="Heading2"/>
       </w:pPr>
       <w:r>
-        <w:t>Добавить документ</w:t>
+        <w:t>Резервная копия и восстановление</w:t>
       </w:r>
     </w:p>
     <w:p>
-      <w:pPr>
-        <w:ind w:left="288" w:hanging="288"/>
-      </w:pPr>
       <w:r>
-        <w:t xml:space="preserve">1. Откройте </w:t>
+        <w:t xml:space="preserve">В управлении откройте </w:t>
       </w:r>
       <w:r>
         <w:rPr>
           <w:b/>
         </w:rPr>
-        <w:t>«Документы»</w:t>
+        <w:t>«Резервная копия»</w:t>
       </w:r>
       <w:r>
-        <w:t xml:space="preserve">, нажмите </w:t>
+        <w:t xml:space="preserve">. </w:t>
       </w:r>
       <w:r>
         <w:rPr>
           <w:b/>
         </w:rPr>
-        <w:t>Add an item</w:t>
+        <w:t>«Скачать тексты и настройки»</w:t>
       </w:r>
       <w:r>
-        <w:t>.</w:t>
+        <w:t xml:space="preserve"> выгружает JSON всех девяти разделов, включая скрытые записи. Архив по соседней ссылке содержит также фотографии и документы. Упакованная демоверсия не заменяет отдельный комплект размещения на SpaceWeb.</w:t>
       </w:r>
     </w:p>
     <w:p>
-      <w:pPr>
-        <w:ind w:left="288" w:hanging="288"/>
-      </w:pPr>
       <w:r>
-        <w:t xml:space="preserve">2. Укажите </w:t>
-      </w:r>
-      <w:r>
-        <w:rPr>
-          <w:b/>
-        </w:rPr>
-        <w:t>«Название документа»</w:t>
-      </w:r>
-      <w:r>
-        <w:t xml:space="preserve">, </w:t>
-      </w:r>
-      <w:r>
-        <w:rPr>
-          <w:b/>
-        </w:rPr>
-        <w:t>«Категория»</w:t>
-      </w:r>
-      <w:r>
-        <w:t>, дату и краткое пояснение. Доступные категории: «Устав», «Собрания», «Финансы», «Бланки», «Другое».</w:t>
-      </w:r>
-    </w:p>
-    <w:p>
-      <w:pPr>
-        <w:ind w:left="288" w:hanging="288"/>
-      </w:pPr>
-      <w:r>
-        <w:t xml:space="preserve">3. Через </w:t>
-      </w:r>
-      <w:r>
-        <w:rPr>
-          <w:b/>
-        </w:rPr>
-        <w:t>«Загрузить или выбрать файл»</w:t>
-      </w:r>
-      <w:r>
-        <w:t xml:space="preserve"> загрузите документ с компьютера или выберите существующий. Подойдут PDF, Word и таблицы; рекомендуемый размер — до 10 МБ.</w:t>
-      </w:r>
-    </w:p>
-    <w:p>
-      <w:pPr>
-        <w:ind w:left="288" w:hanging="288"/>
-      </w:pPr>
-      <w:r>
-        <w:t xml:space="preserve">4. Включите </w:t>
-      </w:r>
-      <w:r>
-        <w:rPr>
-          <w:b/>
-        </w:rPr>
-        <w:t>«Показывать на сайте»</w:t>
-      </w:r>
-      <w:r>
-        <w:t xml:space="preserve"> и нажмите </w:t>
-      </w:r>
-      <w:r>
-        <w:rPr>
-          <w:b/>
-        </w:rPr>
-        <w:t>Save</w:t>
-      </w:r>
-      <w:r>
-        <w:t>.</w:t>
-      </w:r>
-    </w:p>
-    <w:p>
-      <w:pPr>
-        <w:ind w:left="288" w:hanging="288"/>
-      </w:pPr>
-      <w:r>
-        <w:t>5. На публичном сайте откройте документ и проверьте, что скачивается правильный файл.</w:t>
+        <w:t>Сохраняйте копию перед крупными изменениями. Импорта JSON одной кнопкой нет. Для восстановления передайте владельцу копию и название нужного раздела; владелец восстанавливает материалы через репозиторий. Не заменяйте весь проект старой копией, если после неё другие редакторы внесли изменения.</w:t>
       </w:r>
     </w:p>
     <w:p>
@@ -1054,123 +1192,12 @@
         <w:pStyle w:val="Heading2"/>
       </w:pPr>
       <w:r>
-        <w:t>Изменить контакты</w:t>
+        <w:t>Доступ и удаление материалов</w:t>
       </w:r>
     </w:p>
     <w:p>
       <w:r>
-        <w:t xml:space="preserve">В разделе </w:t>
-      </w:r>
-      <w:r>
-        <w:rPr>
-          <w:b/>
-        </w:rPr>
-        <w:t>«Контакты и правление»</w:t>
-      </w:r>
-      <w:r>
-        <w:t xml:space="preserve"> измените адрес, телефон, электронную почту, время и место приёма. В списке </w:t>
-      </w:r>
-      <w:r>
-        <w:rPr>
-          <w:b/>
-        </w:rPr>
-        <w:t>«Состав правления»</w:t>
-      </w:r>
-      <w:r>
-        <w:t xml:space="preserve"> указываются имя и должность. Нажмите </w:t>
-      </w:r>
-      <w:r>
-        <w:rPr>
-          <w:b/>
-        </w:rPr>
-        <w:t>Save</w:t>
-      </w:r>
-      <w:r>
-        <w:t>, затем проверьте раздел контактов на сайте. Отдельного выключателя показа у этого раздела нет.</w:t>
-      </w:r>
-    </w:p>
-    <w:p>
-      <w:pPr>
-        <w:pStyle w:val="Heading2"/>
-      </w:pPr>
-      <w:r>
-        <w:t>Остальные разделы</w:t>
-      </w:r>
-    </w:p>
-    <w:p>
-      <w:r>
-        <w:t xml:space="preserve">В </w:t>
-      </w:r>
-      <w:r>
-        <w:rPr>
-          <w:b/>
-        </w:rPr>
-        <w:t>«Собрания»</w:t>
-      </w:r>
-      <w:r>
-        <w:t xml:space="preserve"> задаются название, дата, время и место, повестка и переключатель показа. В </w:t>
-      </w:r>
-      <w:r>
-        <w:rPr>
-          <w:b/>
-        </w:rPr>
-        <w:t>«Вопросы и ответы»</w:t>
-      </w:r>
-      <w:r>
-        <w:t xml:space="preserve"> — вопрос и ответ. В </w:t>
-      </w:r>
-      <w:r>
-        <w:rPr>
-          <w:b/>
-        </w:rPr>
-        <w:t>«Взносы и реквизиты»</w:t>
-      </w:r>
-      <w:r>
-        <w:t xml:space="preserve"> — сроки, пояснения и банковские реквизиты. Перед включением </w:t>
-      </w:r>
-      <w:r>
-        <w:rPr>
-          <w:b/>
-        </w:rPr>
-        <w:t>«Показывать реквизиты на сайте»</w:t>
-      </w:r>
-      <w:r>
-        <w:t xml:space="preserve"> заполните и сверьте получателя, ИНН, банк, БИК и расчётный счёт. После каждого изменения нажимайте </w:t>
-      </w:r>
-      <w:r>
-        <w:rPr>
-          <w:b/>
-        </w:rPr>
-        <w:t>Save</w:t>
-      </w:r>
-      <w:r>
-        <w:t>.</w:t>
-      </w:r>
-    </w:p>
-    <w:p>
-      <w:r>
-        <w:br w:type="page"/>
-      </w:r>
-    </w:p>
-    <w:p>
-      <w:pPr>
-        <w:pStyle w:val="Heading1"/>
-      </w:pPr>
-      <w:r>
-        <w:t>5 Доступы файлы и частые ситуации</w:t>
-      </w:r>
-    </w:p>
-    <w:p>
-      <w:pPr>
-        <w:pStyle w:val="Heading2"/>
-      </w:pPr>
-      <w:r>
-        <w:t>Дать доступ редактору</w:t>
-      </w:r>
-    </w:p>
-    <w:p>
-      <w:r>
-        <w:t xml:space="preserve">Владелец открывает Pages CMS, входит через GitHub и выбирает </w:t>
+        <w:t xml:space="preserve">Владелец входит в Pages CMS через GitHub и открывает </w:t>
       </w:r>
       <w:r>
         <w:rPr>
@@ -1179,16 +1206,7 @@
         <w:t>Collaborators → Invite a collaborator</w:t>
       </w:r>
       <w:r>
-        <w:t xml:space="preserve">. Он указывает почту человека и нажимает </w:t>
-      </w:r>
-      <w:r>
-        <w:rPr>
-          <w:b/>
-        </w:rPr>
-        <w:t>Send invite</w:t>
-      </w:r>
-      <w:r>
-        <w:t xml:space="preserve">. Редактор принимает приглашение и входит со своей почтой. Чтобы отозвать доступ, владелец удаляет его в </w:t>
+        <w:t xml:space="preserve">. Он указывает почту, отправляет приглашение, а редактор принимает его. Для отзыва доступа владелец удаляет редактора в </w:t>
       </w:r>
       <w:r>
         <w:rPr>
@@ -1197,7 +1215,12 @@
         <w:t>Collaborators</w:t>
       </w:r>
       <w:r>
-        <w:t>. Каждому редактору нужен собственный доступ; эта инструкция не выдаёт приглашение автоматически.</w:t>
+        <w:t>. У каждого редактора должен быть собственный вход.</w:t>
+      </w:r>
+    </w:p>
+    <w:p>
+      <w:r>
+        <w:t>Выключение показа не закрывает вложение по прямой ссылке. Чтобы убрать файл из текущей версии, удалите ссылки на него и затем сам файл в медиатеке. Прежние версии могут оставаться в истории публичного GitHub-проекта. Загружайте только материалы для открытого сайта.</w:t>
       </w:r>
     </w:p>
     <w:p>
@@ -1205,209 +1228,75 @@
         <w:pStyle w:val="Heading2"/>
       </w:pPr>
       <w:r>
-        <w:t>Скрыть запись и удалить файл</w:t>
+        <w:t>Адреса для работы</w:t>
       </w:r>
     </w:p>
     <w:p>
-      <w:r>
-        <w:t xml:space="preserve">Выключатель </w:t>
-      </w:r>
-      <w:r>
-        <w:rPr>
-          <w:b/>
-        </w:rPr>
-        <w:t>«Показывать на сайте»</w:t>
-      </w:r>
-      <w:r>
-        <w:t xml:space="preserve"> убирает запись из интерфейса. Он не закрывает файл по прямой ссылке. Чтобы убрать вложение из текущей версии, сначала удалите использующие его ссылки, затем удалите сам файл в </w:t>
-      </w:r>
-      <w:r>
-        <w:rPr>
-          <w:b/>
-        </w:rPr>
-        <w:t>«Файлы документов»</w:t>
-      </w:r>
-      <w:r>
-        <w:t xml:space="preserve"> или </w:t>
-      </w:r>
-      <w:r>
-        <w:rPr>
-          <w:b/>
-        </w:rPr>
-        <w:t>«Фотографии»</w:t>
-      </w:r>
-      <w:r>
-        <w:t>.</w:t>
-      </w:r>
-    </w:p>
-    <w:p>
-      <w:r>
-        <w:t>CMS сохраняет данные в публичном репозитории GitHub. Даже после скрытия или удаления прежняя версия может оставаться в истории изменений. Поэтому здесь хранятся материалы для открытого сайта. Это относится и к суммам задолженности; имена плательщиков и платёжные документы в форму задолженности не добавляются.</w:t>
-      </w:r>
-    </w:p>
-    <w:p>
-      <w:pPr>
-        <w:pStyle w:val="Heading2"/>
-      </w:pPr>
-      <w:r>
-        <w:t>Сделать копию материалов</w:t>
-      </w:r>
-    </w:p>
-    <w:p>
-      <w:r>
-        <w:t xml:space="preserve">На </w:t>
-      </w:r>
       <w:hyperlink r:id="rId11">
         <w:r>
           <w:rPr>
             <w:color w:val="24534B"/>
             <w:u w:val="single"/>
           </w:rPr>
-          <w:t>странице управления</w:t>
+          <w:t>Управление</w:t>
         </w:r>
       </w:hyperlink>
       <w:r>
-        <w:t xml:space="preserve"> нажмите </w:t>
+        <w:t xml:space="preserve"> · </w:t>
       </w:r>
-      <w:r>
-        <w:rPr>
-          <w:b/>
-        </w:rPr>
-        <w:t>«Скачать содержимое»</w:t>
-      </w:r>
-      <w:r>
-        <w:t xml:space="preserve"> для выгрузки текстов и настроек. Фотографии и документы входят в ZIP-архив по соседней ссылке. Эти копии могут содержать скрытые записи. Кнопки восстановления из файла в интерфейсе нет — восстановление выполняет владелец через репозиторий.</w:t>
-      </w:r>
-    </w:p>
-    <w:p>
-      <w:pPr>
-        <w:pStyle w:val="Heading2"/>
-      </w:pPr>
-      <w:r>
-        <w:t>Если Save неактивна или данные не принимаются</w:t>
-      </w:r>
-    </w:p>
-    <w:p>
-      <w:r>
-        <w:t xml:space="preserve">Сначала проверьте обязательные поля, положительную сумму и отсутствие повторяющегося дома. Если после предыдущего сохранения удаление последней записи не активировало </w:t>
-      </w:r>
-      <w:r>
-        <w:rPr>
-          <w:b/>
-        </w:rPr>
-        <w:t>Save</w:t>
-      </w:r>
-      <w:r>
-        <w:t>, заново загрузите форму и повторите удаление. Перед перезагрузкой запомните несохранённые изменения: они могут быть потеряны.</w:t>
-      </w:r>
-    </w:p>
-    <w:p>
-      <w:r>
-        <w:t>Если проблема сохраняется, передайте владельцу название раздела, время действия и текст ошибки. Пароль, код входа или содержимое приватной учётной записи для этого пересылать не нужно.</w:t>
-      </w:r>
-    </w:p>
-    <w:p>
-      <w:pPr>
-        <w:pStyle w:val="Heading2"/>
-      </w:pPr>
-      <w:r>
-        <w:t>Основные адреса</w:t>
-      </w:r>
-    </w:p>
-    <w:p>
-      <w:pPr>
-        <w:pStyle w:val="ListBullet"/>
-        <w:ind w:left="259" w:hanging="216"/>
-      </w:pPr>
       <w:hyperlink r:id="rId14">
         <w:r>
           <w:rPr>
             <w:color w:val="24534B"/>
             <w:u w:val="single"/>
           </w:rPr>
-          <w:t>Публичный сайт</w:t>
+          <w:t>Карта</w:t>
         </w:r>
       </w:hyperlink>
-    </w:p>
-    <w:p>
-      <w:pPr>
-        <w:pStyle w:val="ListBullet"/>
-        <w:ind w:left="259" w:hanging="216"/>
-      </w:pPr>
-      <w:hyperlink r:id="rId11">
-        <w:r>
-          <w:rPr>
-            <w:color w:val="24534B"/>
-            <w:u w:val="single"/>
-          </w:rPr>
-          <w:t>Управление и проверка публикации</w:t>
-        </w:r>
-      </w:hyperlink>
-    </w:p>
-    <w:p>
-      <w:pPr>
-        <w:pStyle w:val="ListBullet"/>
-        <w:ind w:left="259" w:hanging="216"/>
-      </w:pPr>
-      <w:hyperlink r:id="rId13">
-        <w:r>
-          <w:rPr>
-            <w:color w:val="24534B"/>
-            <w:u w:val="single"/>
-          </w:rPr>
-          <w:t>Карта домов</w:t>
-        </w:r>
-      </w:hyperlink>
-    </w:p>
-    <w:p>
-      <w:pPr>
-        <w:pStyle w:val="ListBullet"/>
-        <w:ind w:left="259" w:hanging="216"/>
-      </w:pPr>
+      <w:r>
+        <w:t xml:space="preserve"> · </w:t>
+      </w:r>
       <w:hyperlink r:id="rId12">
         <w:r>
           <w:rPr>
             <w:color w:val="24534B"/>
             <w:u w:val="single"/>
           </w:rPr>
-          <w:t>Редактор Pages CMS</w:t>
+          <w:t>Pages CMS</w:t>
         </w:r>
       </w:hyperlink>
-    </w:p>
-    <w:p>
-      <w:pPr>
-        <w:pStyle w:val="ListBullet"/>
-        <w:ind w:left="259" w:hanging="216"/>
-      </w:pPr>
+      <w:r>
+        <w:t xml:space="preserve"> · </w:t>
+      </w:r>
       <w:hyperlink r:id="rId15">
         <w:r>
           <w:rPr>
             <w:color w:val="24534B"/>
             <w:u w:val="single"/>
           </w:rPr>
-          <w:t>Документация Pages CMS по приглашениям</w:t>
+          <w:t>Правила доступа Pages CMS</w:t>
         </w:r>
       </w:hyperlink>
     </w:p>
     <w:p>
       <w:r>
-        <w:t xml:space="preserve">Инструкция соответствует редакторской схеме проекта на 24 сентября 2026 года. Источник проверки нумерации: </w:t>
+        <w:t xml:space="preserve">После переноса управление будет доступно на домене заказчика по пути </w:t>
       </w:r>
       <w:r>
         <w:rPr>
           <w:rFonts w:ascii="Consolas" w:hAnsi="Consolas"/>
           <w:sz w:val="21"/>
         </w:rPr>
-        <w:t>docs/PARCEL-NUMBERS-2026-09-23.md</w:t>
+        <w:t>/?page=manage</w:t>
       </w:r>
       <w:r>
-        <w:t xml:space="preserve"> в исходном проекте. Редактирование содержимого не заменяет настройку хостинга или видеосервера.</w:t>
+        <w:t>; редактор Pages CMS останется тем же. Текущую готовность домена и HTTPS уточняет владелец при передаче.</w:t>
       </w:r>
     </w:p>
     <w:sectPr>
       <w:headerReference w:type="default" r:id="rId9"/>
       <w:footerReference w:type="default" r:id="rId10"/>
-      <w:pgSz w:w="12240" w:h="15840"/>
+      <w:pgSz w:w="11905" w:h="16838"/>
       <w:pgMar w:top="936" w:right="1152" w:bottom="936" w:left="1152" w:header="360" w:footer="360" w:gutter="0"/>
       <w:cols w:space="720"/>
       <w:docGrid w:linePitch="360"/>
@@ -1824,12 +1713,12 @@
     <w:rsid w:val="00FC693F"/>
     <w:pPr>
       <w:widowControl/>
-      <w:spacing w:after="140" w:line="264" w:lineRule="auto"/>
+      <w:spacing w:after="120" w:line="257" w:lineRule="auto"/>
     </w:pPr>
     <w:rPr>
       <w:rFonts w:ascii="Calibri" w:hAnsi="Calibri"/>
       <w:color w:val="000000"/>
-      <w:sz w:val="23"/>
+      <w:sz w:val="22"/>
     </w:rPr>
   </w:style>
   <w:style w:type="paragraph" w:styleId="Header">
@@ -1888,7 +1777,7 @@
       <w:keepNext/>
       <w:keepLines/>
       <w:widowControl/>
-      <w:spacing w:before="160" w:after="180" w:line="264" w:lineRule="auto"/>
+      <w:spacing w:before="160" w:after="180" w:line="257" w:lineRule="auto"/>
       <w:outlineLvl w:val="0"/>
     </w:pPr>
     <w:rPr>
@@ -1913,7 +1802,7 @@
       <w:keepNext/>
       <w:keepLines/>
       <w:widowControl/>
-      <w:spacing w:before="200" w:after="100" w:line="264" w:lineRule="auto"/>
+      <w:spacing w:before="200" w:after="100" w:line="257" w:lineRule="auto"/>
       <w:outlineLvl w:val="1"/>
     </w:pPr>
     <w:rPr>
@@ -1938,7 +1827,7 @@
       <w:keepNext/>
       <w:keepLines/>
       <w:widowControl/>
-      <w:spacing w:before="200" w:after="140" w:line="264" w:lineRule="auto"/>
+      <w:spacing w:before="200" w:after="120" w:line="257" w:lineRule="auto"/>
       <w:outlineLvl w:val="2"/>
     </w:pPr>
     <w:rPr>
@@ -1946,7 +1835,7 @@
       <w:b/>
       <w:bCs/>
       <w:color w:val="000000"/>
-      <w:sz w:val="23"/>
+      <w:sz w:val="22"/>
     </w:rPr>
   </w:style>
   <w:style w:type="paragraph" w:styleId="Heading4">
@@ -2179,7 +2068,7 @@
     <w:pPr>
       <w:keepNext/>
       <w:widowControl/>
-      <w:spacing w:after="180" w:line="264" w:lineRule="auto" w:before="0"/>
+      <w:spacing w:after="180" w:line="257" w:lineRule="auto" w:before="0"/>
       <w:contextualSpacing/>
     </w:pPr>
     <w:rPr>
@@ -2220,7 +2109,7 @@
       <w:numPr>
         <w:ilvl w:val="1"/>
       </w:numPr>
-      <w:spacing w:after="140" w:line="264" w:lineRule="auto"/>
+      <w:spacing w:after="120" w:line="257" w:lineRule="auto"/>
     </w:pPr>
     <w:rPr>
       <w:rFonts w:asciiTheme="majorHAnsi" w:eastAsiaTheme="majorEastAsia" w:hAnsiTheme="majorHAnsi" w:cstheme="majorBidi" w:ascii="Calibri" w:hAnsi="Calibri"/>
@@ -2228,7 +2117,7 @@
       <w:iCs/>
       <w:color w:val="000000"/>
       <w:spacing w:val="15"/>
-      <w:sz w:val="23"/>
+      <w:sz w:val="22"/>
       <w:szCs w:val="24"/>
     </w:rPr>
   </w:style>
@@ -2365,13 +2254,13 @@
       <w:numPr>
         <w:numId w:val="1"/>
       </w:numPr>
-      <w:spacing w:after="140" w:line="264" w:lineRule="auto"/>
+      <w:spacing w:after="120" w:line="257" w:lineRule="auto"/>
       <w:contextualSpacing/>
     </w:pPr>
     <w:rPr>
       <w:rFonts w:ascii="Calibri" w:hAnsi="Calibri"/>
       <w:color w:val="000000"/>
-      <w:sz w:val="23"/>
+      <w:sz w:val="22"/>
     </w:rPr>
   </w:style>
   <w:style w:type="paragraph" w:styleId="ListBullet2">
@@ -2411,13 +2300,13 @@
       <w:numPr>
         <w:numId w:val="5"/>
       </w:numPr>
-      <w:spacing w:after="140" w:line="264" w:lineRule="auto"/>
+      <w:spacing w:after="120" w:line="257" w:lineRule="auto"/>
       <w:contextualSpacing/>
     </w:pPr>
     <w:rPr>
       <w:rFonts w:ascii="Calibri" w:hAnsi="Calibri"/>
       <w:color w:val="000000"/>
-      <w:sz w:val="23"/>
+      <w:sz w:val="22"/>
     </w:rPr>
   </w:style>
   <w:style w:type="paragraph" w:styleId="ListNumber2">

</xml_diff>

<commit_message>
Prepare native hosting administration and move debt ledger to owners
</commit_message>
<xml_diff>
--- a/uploads/documents/prometey-admin-guide.docx
+++ b/uploads/documents/prometey-admin-guide.docx
@@ -18,21 +18,23 @@
         <w:rPr>
           <w:sz w:val="20"/>
         </w:rPr>
-        <w:t>Памятка редактору · 13 октября 2026 года</w:t>
+        <w:t>Памятка редактору · 14 октября 2026 года</w:t>
       </w:r>
     </w:p>
     <w:p>
       <w:r>
-        <w:t xml:space="preserve">Через редактор можно менять тексты главной страницы и фотоальбом, задолженность на карте, новости, документы и сведения правления. Сохранение выполняется в </w:t>
-      </w:r>
+        <w:t>Здесь описана новая админка на самом сайте. Через неё можно менять тексты, фотографии, задолженность, новости, документы и сведения правления. Все действия выполняются в одном окне; отдельный внешний редактор не нужен.</w:t>
+      </w:r>
+    </w:p>
+    <w:p>
       <w:r>
         <w:rPr>
           <w:b/>
         </w:rPr>
-        <w:t>Pages CMS</w:t>
-      </w:r>
-      <w:r>
-        <w:t>. Страница управления на самом сайте помогает выбрать задачу и проверить опубликованные данные.</w:t>
+        <w:t>Перед первым входом:</w:t>
+      </w:r>
+      <w:r>
+        <w:t xml:space="preserve"> владелец хостинга должен включить исправный HTTPS и активировать управление. На дату подготовки памятки этот шаг ещё ожидает владельца. Наличие инструкции не означает, что вход на рабочем домене уже включён.</w:t>
       </w:r>
     </w:p>
     <w:p>
@@ -57,16 +59,476 @@
         </w:r>
       </w:hyperlink>
       <w:r>
-        <w:t xml:space="preserve"> и нажмите </w:t>
+        <w:t xml:space="preserve">. Ссылка также находится внизу сайта. Введите выданные владельцем </w:t>
       </w:r>
       <w:r>
         <w:rPr>
           <w:b/>
         </w:rPr>
-        <w:t>«Войти в редактор»</w:t>
-      </w:r>
-      <w:r>
-        <w:t xml:space="preserve">. Ссылка на управление также находится внизу сайта. Можно сразу открыть </w:t>
+        <w:t>«Логин»</w:t>
+      </w:r>
+      <w:r>
+        <w:t xml:space="preserve"> и </w:t>
+      </w:r>
+      <w:r>
+        <w:rPr>
+          <w:b/>
+        </w:rPr>
+        <w:t>«Пароль»</w:t>
+      </w:r>
+      <w:r>
+        <w:t xml:space="preserve">, затем нажмите </w:t>
+      </w:r>
+      <w:r>
+        <w:rPr>
+          <w:b/>
+        </w:rPr>
+        <w:t>«Войти»</w:t>
+      </w:r>
+      <w:r>
+        <w:t>. Это отдельные данные управления сайтом, не пароль от хостинга.</w:t>
+      </w:r>
+    </w:p>
+    <w:p>
+      <w:pPr>
+        <w:pStyle w:val="Heading2"/>
+      </w:pPr>
+      <w:r>
+        <w:t>Первый вход владельца</w:t>
+      </w:r>
+    </w:p>
+    <w:p>
+      <w:r>
+        <w:t xml:space="preserve">Если открылась форма </w:t>
+      </w:r>
+      <w:r>
+        <w:rPr>
+          <w:b/>
+        </w:rPr>
+        <w:t>«Первое включение»</w:t>
+      </w:r>
+      <w:r>
+        <w:t xml:space="preserve">, введите переданный для установки </w:t>
+      </w:r>
+      <w:r>
+        <w:rPr>
+          <w:b/>
+        </w:rPr>
+        <w:t>«Код активации»</w:t>
+      </w:r>
+      <w:r>
+        <w:t xml:space="preserve">, придумайте логин и пароль, повторите пароль и нажмите </w:t>
+      </w:r>
+      <w:r>
+        <w:rPr>
+          <w:b/>
+        </w:rPr>
+        <w:t>«Активировать управление»</w:t>
+      </w:r>
+      <w:r>
+        <w:t>. Код используется только при первоначальной настройке.</w:t>
+      </w:r>
+    </w:p>
+    <w:p>
+      <w:pPr>
+        <w:pStyle w:val="ListBullet"/>
+        <w:ind w:left="259" w:hanging="216"/>
+      </w:pPr>
+      <w:r>
+        <w:t>Логин: от 3 до 64 символов; латинские буквы, цифры, точка, дефис и подчёркивание. Первый символ — буква или цифра.</w:t>
+      </w:r>
+    </w:p>
+    <w:p>
+      <w:pPr>
+        <w:pStyle w:val="ListBullet"/>
+        <w:ind w:left="259" w:hanging="216"/>
+      </w:pPr>
+      <w:r>
+        <w:t>Пароль: не менее 12 символов. Сохраните его в менеджере паролей.</w:t>
+      </w:r>
+    </w:p>
+    <w:p>
+      <w:pPr>
+        <w:pStyle w:val="ListBullet"/>
+        <w:ind w:left="259" w:hanging="216"/>
+      </w:pPr>
+      <w:r>
+        <w:t>В системе одна учётная запись управления. Приглашение по почте для входа не требуется.</w:t>
+      </w:r>
+    </w:p>
+    <w:p>
+      <w:r>
+        <w:t xml:space="preserve">Если браузер сообщает о недоверенном сертификате, попросите владельца исправить HTTPS. Не вводите пароль через исключение безопасности. После 30 минут бездействия может потребоваться повторный вход; завершив работу, нажмите </w:t>
+      </w:r>
+      <w:r>
+        <w:rPr>
+          <w:b/>
+        </w:rPr>
+        <w:t>«Выйти»</w:t>
+      </w:r>
+      <w:r>
+        <w:t>.</w:t>
+      </w:r>
+    </w:p>
+    <w:p>
+      <w:pPr>
+        <w:pStyle w:val="Heading2"/>
+      </w:pPr>
+      <w:r>
+        <w:t>Где что менять</w:t>
+      </w:r>
+    </w:p>
+    <w:p>
+      <w:pPr>
+        <w:pStyle w:val="ListBullet"/>
+        <w:ind w:left="259" w:hanging="216"/>
+      </w:pPr>
+      <w:r>
+        <w:rPr>
+          <w:b/>
+        </w:rPr>
+        <w:t>Карта и задолженность</w:t>
+      </w:r>
+      <w:r>
+        <w:t xml:space="preserve"> — дом, сумма и уточнение номера.</w:t>
+      </w:r>
+    </w:p>
+    <w:p>
+      <w:pPr>
+        <w:pStyle w:val="ListBullet"/>
+        <w:ind w:left="259" w:hanging="216"/>
+      </w:pPr>
+      <w:r>
+        <w:rPr>
+          <w:b/>
+        </w:rPr>
+        <w:t>Главная страница и фотоальбом</w:t>
+      </w:r>
+      <w:r>
+        <w:t xml:space="preserve"> — тексты пролёта, фотографии и заголовки.</w:t>
+      </w:r>
+    </w:p>
+    <w:p>
+      <w:pPr>
+        <w:pStyle w:val="ListBullet"/>
+        <w:ind w:left="259" w:hanging="216"/>
+      </w:pPr>
+      <w:r>
+        <w:rPr>
+          <w:b/>
+        </w:rPr>
+        <w:t>Новости и объявления</w:t>
+      </w:r>
+      <w:r>
+        <w:t xml:space="preserve">, </w:t>
+      </w:r>
+      <w:r>
+        <w:rPr>
+          <w:b/>
+        </w:rPr>
+        <w:t>Документы</w:t>
+      </w:r>
+      <w:r>
+        <w:t xml:space="preserve">, </w:t>
+      </w:r>
+      <w:r>
+        <w:rPr>
+          <w:b/>
+        </w:rPr>
+        <w:t>Собрания</w:t>
+      </w:r>
+      <w:r>
+        <w:t xml:space="preserve"> — материалы жителей.</w:t>
+      </w:r>
+    </w:p>
+    <w:p>
+      <w:pPr>
+        <w:pStyle w:val="ListBullet"/>
+        <w:ind w:left="259" w:hanging="216"/>
+      </w:pPr>
+      <w:r>
+        <w:rPr>
+          <w:b/>
+        </w:rPr>
+        <w:t>Контакты и правление</w:t>
+      </w:r>
+      <w:r>
+        <w:t xml:space="preserve">, </w:t>
+      </w:r>
+      <w:r>
+        <w:rPr>
+          <w:b/>
+        </w:rPr>
+        <w:t>Взносы и реквизиты</w:t>
+      </w:r>
+      <w:r>
+        <w:t xml:space="preserve"> — официальные сведения.</w:t>
+      </w:r>
+    </w:p>
+    <w:p>
+      <w:pPr>
+        <w:pStyle w:val="ListBullet"/>
+        <w:ind w:left="259" w:hanging="216"/>
+      </w:pPr>
+      <w:r>
+        <w:rPr>
+          <w:b/>
+        </w:rPr>
+        <w:t>Вопросы и ответы</w:t>
+      </w:r>
+      <w:r>
+        <w:t xml:space="preserve">, </w:t>
+      </w:r>
+      <w:r>
+        <w:rPr>
+          <w:b/>
+        </w:rPr>
+        <w:t>Камеры</w:t>
+      </w:r>
+      <w:r>
+        <w:t xml:space="preserve"> — справочная информация и карточки камер.</w:t>
+      </w:r>
+    </w:p>
+    <w:p>
+      <w:pPr>
+        <w:pStyle w:val="ListBullet"/>
+        <w:ind w:left="259" w:hanging="216"/>
+      </w:pPr>
+      <w:r>
+        <w:rPr>
+          <w:b/>
+        </w:rPr>
+        <w:t>Фотографии и файлы</w:t>
+      </w:r>
+      <w:r>
+        <w:t xml:space="preserve"> — общая библиотека вложений и корзина.</w:t>
+      </w:r>
+    </w:p>
+    <w:p>
+      <w:r>
+        <w:t xml:space="preserve">После изменения формы нажмите </w:t>
+      </w:r>
+      <w:r>
+        <w:rPr>
+          <w:b/>
+        </w:rPr>
+        <w:t>«Сохранить и опубликовать»</w:t>
+      </w:r>
+      <w:r>
+        <w:t xml:space="preserve">. Дождитесь сообщения об успехе, затем откройте </w:t>
+      </w:r>
+      <w:r>
+        <w:rPr>
+          <w:b/>
+        </w:rPr>
+        <w:t>«Проверить на сайте»</w:t>
+      </w:r>
+      <w:r>
+        <w:t xml:space="preserve"> и обновите публичную страницу. Сохранение на хостинге сразу обновляет данные сайта.</w:t>
+      </w:r>
+    </w:p>
+    <w:p>
+      <w:r>
+        <w:br w:type="page"/>
+      </w:r>
+    </w:p>
+    <w:p>
+      <w:pPr>
+        <w:pStyle w:val="Heading1"/>
+      </w:pPr>
+      <w:r>
+        <w:t>2 Задолженность и карта домов</w:t>
+      </w:r>
+    </w:p>
+    <w:p>
+      <w:pPr>
+        <w:pStyle w:val="Heading2"/>
+      </w:pPr>
+      <w:r>
+        <w:t>Добавить или исправить сумму</w:t>
+      </w:r>
+    </w:p>
+    <w:p>
+      <w:pPr>
+        <w:ind w:left="288" w:hanging="288"/>
+      </w:pPr>
+      <w:r>
+        <w:t xml:space="preserve">1. Откройте </w:t>
+      </w:r>
+      <w:r>
+        <w:rPr>
+          <w:b/>
+        </w:rPr>
+        <w:t>«Карта и задолженность»</w:t>
+      </w:r>
+      <w:r>
+        <w:t xml:space="preserve">. В группе </w:t>
+      </w:r>
+      <w:r>
+        <w:rPr>
+          <w:b/>
+        </w:rPr>
+        <w:t>«Задолженность»</w:t>
+      </w:r>
+      <w:r>
+        <w:t xml:space="preserve"> нажмите </w:t>
+      </w:r>
+      <w:r>
+        <w:rPr>
+          <w:b/>
+        </w:rPr>
+        <w:t>«Добавить запись»</w:t>
+      </w:r>
+      <w:r>
+        <w:t>. Для исправления откройте существующую запись.</w:t>
+      </w:r>
+    </w:p>
+    <w:p>
+      <w:pPr>
+        <w:ind w:left="288" w:hanging="288"/>
+      </w:pPr>
+      <w:r>
+        <w:t xml:space="preserve">2. Выберите </w:t>
+      </w:r>
+      <w:r>
+        <w:rPr>
+          <w:b/>
+        </w:rPr>
+        <w:t>«Дом»</w:t>
+      </w:r>
+      <w:r>
+        <w:t>. Проверяйте полный номер: буква или обозначение «с1» могут относиться к отдельному строению.</w:t>
+      </w:r>
+    </w:p>
+    <w:p>
+      <w:pPr>
+        <w:ind w:left="288" w:hanging="288"/>
+      </w:pPr>
+      <w:r>
+        <w:t xml:space="preserve">3. Заполните </w:t>
+      </w:r>
+      <w:r>
+        <w:rPr>
+          <w:b/>
+        </w:rPr>
+        <w:t>«Сумма задолженности, ₽»</w:t>
+      </w:r>
+      <w:r>
+        <w:t xml:space="preserve"> положительным числом, максимум с двумя знаками после десятичного разделителя. Например, </w:t>
+      </w:r>
+      <w:r>
+        <w:rPr>
+          <w:rFonts w:ascii="Consolas" w:hAnsi="Consolas"/>
+          <w:sz w:val="21"/>
+        </w:rPr>
+        <w:t>12500</w:t>
+      </w:r>
+      <w:r>
+        <w:t xml:space="preserve"> или </w:t>
+      </w:r>
+      <w:r>
+        <w:rPr>
+          <w:rFonts w:ascii="Consolas" w:hAnsi="Consolas"/>
+          <w:sz w:val="21"/>
+        </w:rPr>
+        <w:t>12500.50</w:t>
+      </w:r>
+      <w:r>
+        <w:t xml:space="preserve"> — это только примеры формата.</w:t>
+      </w:r>
+    </w:p>
+    <w:p>
+      <w:pPr>
+        <w:ind w:left="288" w:hanging="288"/>
+      </w:pPr>
+      <w:r>
+        <w:t xml:space="preserve">4. Сверьте номер и сумму с учётом правления. </w:t>
+      </w:r>
+      <w:r>
+        <w:rPr>
+          <w:b/>
+        </w:rPr>
+        <w:t>Один дом должен встречаться в списке один раз.</w:t>
+      </w:r>
+    </w:p>
+    <w:p>
+      <w:pPr>
+        <w:ind w:left="288" w:hanging="288"/>
+      </w:pPr>
+      <w:r>
+        <w:t xml:space="preserve">5. Нажмите </w:t>
+      </w:r>
+      <w:r>
+        <w:rPr>
+          <w:b/>
+        </w:rPr>
+        <w:t>«Сохранить и опубликовать»</w:t>
+      </w:r>
+      <w:r>
+        <w:t xml:space="preserve">, дождитесь подтверждения и перейдите по ссылке </w:t>
+      </w:r>
+      <w:r>
+        <w:rPr>
+          <w:b/>
+        </w:rPr>
+        <w:t>«Проверить на сайте»</w:t>
+      </w:r>
+      <w:r>
+        <w:t>.</w:t>
+      </w:r>
+    </w:p>
+    <w:p>
+      <w:r>
+        <w:t>У долга нет отдельного выключателя публикации: сохранённая запись с суммой становится видна посетителям. Дом подсвечивается красным, а в карточке и списке показывается сумма. Сайт не вычисляет долг и не сверяет поступившую оплату автоматически.</w:t>
+      </w:r>
+    </w:p>
+    <w:p>
+      <w:pPr>
+        <w:pStyle w:val="Heading2"/>
+      </w:pPr>
+      <w:r>
+        <w:t>Снять отметку после оплаты</w:t>
+      </w:r>
+    </w:p>
+    <w:p>
+      <w:r>
+        <w:t xml:space="preserve">В нужной записи нажмите значок корзины </w:t>
+      </w:r>
+      <w:r>
+        <w:rPr>
+          <w:b/>
+        </w:rPr>
+        <w:t>«Удалить запись»</w:t>
+      </w:r>
+      <w:r>
+        <w:t xml:space="preserve">, затем </w:t>
+      </w:r>
+      <w:r>
+        <w:rPr>
+          <w:b/>
+        </w:rPr>
+        <w:t>«Сохранить и опубликовать»</w:t>
+      </w:r>
+      <w:r>
+        <w:t>. Не вводите нулевую сумму. До сохранения удаление существует только в открытой форме.</w:t>
+      </w:r>
+    </w:p>
+    <w:p>
+      <w:r>
+        <w:t>После сохранения откройте публичный сайт и убедитесь, что номер больше не находится в списке задолженности и красная отметка исчезла. Если в записи меняли дом, проверьте и прежний, и новый номер.</w:t>
+      </w:r>
+    </w:p>
+    <w:p>
+      <w:pPr>
+        <w:pStyle w:val="Heading2"/>
+      </w:pPr>
+      <w:r>
+        <w:t>Проверить глазами посетителя</w:t>
+      </w:r>
+    </w:p>
+    <w:p>
+      <w:r>
+        <w:t xml:space="preserve">Откройте </w:t>
       </w:r>
       <w:hyperlink r:id="rId12">
         <w:r>
@@ -74,11 +536,943 @@
             <w:color w:val="24534B"/>
             <w:u w:val="single"/>
           </w:rPr>
-          <w:t>Pages CMS для Прометея</w:t>
+          <w:t>Раздел собственников</w:t>
         </w:r>
       </w:hyperlink>
       <w:r>
+        <w:t xml:space="preserve"> или </w:t>
+      </w:r>
+      <w:hyperlink r:id="rId13">
+        <w:r>
+          <w:rPr>
+            <w:color w:val="24534B"/>
+            <w:u w:val="single"/>
+          </w:rPr>
+          <w:t>Список задолженности</w:t>
+        </w:r>
+      </w:hyperlink>
+      <w:r>
+        <w:t>. Выберите нужный дом на карте: сверьте его положение, полный номер и сумму. Проверьте страницу также на телефоне.</w:t>
+      </w:r>
+    </w:p>
+    <w:p>
+      <w:r>
+        <w:t xml:space="preserve">Список задолженности находится внутри </w:t>
+      </w:r>
+      <w:r>
+        <w:rPr>
+          <w:b/>
+        </w:rPr>
+        <w:t>«Собственникам»</w:t>
+      </w:r>
+      <w:r>
+        <w:t>; отдельного пункта в верхнем меню нет. Если правка не видна, обновите страницу. Сообщение об ошибке загрузки данных не означает, что долг снят.</w:t>
+      </w:r>
+    </w:p>
+    <w:p>
+      <w:pPr>
+        <w:pStyle w:val="Heading2"/>
+      </w:pPr>
+      <w:r>
+        <w:t>Если номер отсутствует или указан неверно</w:t>
+      </w:r>
+    </w:p>
+    <w:p>
+      <w:r>
+        <w:t xml:space="preserve">Не выбирайте соседний дом. Передайте владельцу точное положение и подтверждение номера. Группа </w:t>
+      </w:r>
+      <w:r>
+        <w:rPr>
+          <w:b/>
+        </w:rPr>
+        <w:t>«Уточнить или добавить номер»</w:t>
+      </w:r>
+      <w:r>
+        <w:t xml:space="preserve"> меняет подпись существующего контура, но не создаёт новое здание. Сверяйте положение: подпись варианта в списке выбора может оставаться исходной.</w:t>
+      </w:r>
+    </w:p>
+    <w:p>
+      <w:r>
+        <w:t>На карте показаны контуры строений, а не кадастровые границы участков. Полная сверка всех номеров с Яндекс Картами не заявляется.</w:t>
+      </w:r>
+    </w:p>
+    <w:p>
+      <w:r>
+        <w:br w:type="page"/>
+      </w:r>
+    </w:p>
+    <w:p>
+      <w:pPr>
+        <w:pStyle w:val="Heading1"/>
+      </w:pPr>
+      <w:r>
+        <w:t>3 Главная страница и фотографии</w:t>
+      </w:r>
+    </w:p>
+    <w:p>
+      <w:r>
+        <w:t xml:space="preserve">Откройте </w:t>
+      </w:r>
+      <w:r>
+        <w:rPr>
+          <w:b/>
+        </w:rPr>
+        <w:t>«Главная страница и фотоальбом»</w:t>
+      </w:r>
+      <w:r>
+        <w:t xml:space="preserve">. Кнопка </w:t>
+      </w:r>
+      <w:r>
+        <w:rPr>
+          <w:b/>
+        </w:rPr>
+        <w:t>«Сохранить и опубликовать»</w:t>
+      </w:r>
+      <w:r>
+        <w:t xml:space="preserve"> сохраняет всю форму раздела, включая тексты и порядок фотографий.</w:t>
+      </w:r>
+    </w:p>
+    <w:p>
+      <w:pPr>
+        <w:pStyle w:val="Heading2"/>
+      </w:pPr>
+      <w:r>
+        <w:t>Тексты пролёта</w:t>
+      </w:r>
+    </w:p>
+    <w:p>
+      <w:r>
+        <w:t xml:space="preserve">В группе </w:t>
+      </w:r>
+      <w:r>
+        <w:rPr>
+          <w:b/>
+        </w:rPr>
+        <w:t>«Тексты пролёта»</w:t>
+      </w:r>
+      <w:r>
+        <w:t xml:space="preserve"> находятся три сцены. Для каждой меняются надпись над заголовком, две строки заголовка и описание. В строке заголовка допускается до 32 символов. После сохранения проверьте читаемость над пейзажем, особенно на телефоне.</w:t>
+      </w:r>
+    </w:p>
+    <w:p>
+      <w:r>
+        <w:t>Сам фильм, его движение при прокрутке, шрифты и устройство страниц остаются частью программного оформления. Замена текста не изменяет траекторию пролёта.</w:t>
+      </w:r>
+    </w:p>
+    <w:p>
+      <w:pPr>
+        <w:pStyle w:val="Heading2"/>
+      </w:pPr>
+      <w:r>
+        <w:t>Добавить фотографию в альбом</w:t>
+      </w:r>
+    </w:p>
+    <w:p>
+      <w:pPr>
+        <w:ind w:left="288" w:hanging="288"/>
+      </w:pPr>
+      <w:r>
+        <w:t xml:space="preserve">1. В группе </w:t>
+      </w:r>
+      <w:r>
+        <w:rPr>
+          <w:b/>
+        </w:rPr>
+        <w:t>«Фотоальбом» → «Фотографии и порядок»</w:t>
+      </w:r>
+      <w:r>
+        <w:t xml:space="preserve"> нажмите </w:t>
+      </w:r>
+      <w:r>
+        <w:rPr>
+          <w:b/>
+        </w:rPr>
+        <w:t>«Добавить запись»</w:t>
+      </w:r>
+      <w:r>
         <w:t>.</w:t>
+      </w:r>
+    </w:p>
+    <w:p>
+      <w:pPr>
+        <w:ind w:left="288" w:hanging="288"/>
+      </w:pPr>
+      <w:r>
+        <w:t xml:space="preserve">2. Выберите </w:t>
+      </w:r>
+      <w:r>
+        <w:rPr>
+          <w:b/>
+        </w:rPr>
+        <w:t>«Готовая фотография Прометея»</w:t>
+      </w:r>
+      <w:r>
+        <w:t xml:space="preserve"> или загрузите снимок в поле </w:t>
+      </w:r>
+      <w:r>
+        <w:rPr>
+          <w:b/>
+        </w:rPr>
+        <w:t>«Загрузить свою фотографию»</w:t>
+      </w:r>
+      <w:r>
+        <w:t xml:space="preserve"> через кнопку </w:t>
+      </w:r>
+      <w:r>
+        <w:rPr>
+          <w:b/>
+        </w:rPr>
+        <w:t>«Загрузить файл»</w:t>
+      </w:r>
+      <w:r>
+        <w:t>. Можно выбрать уже загруженный файл из библиотеки.</w:t>
+      </w:r>
+    </w:p>
+    <w:p>
+      <w:pPr>
+        <w:ind w:left="288" w:hanging="288"/>
+      </w:pPr>
+      <w:r>
+        <w:t>3. Дождитесь сообщения об успешной загрузке. Если выбраны и готовый снимок, и свой файл, на сайте используется свой файл.</w:t>
+      </w:r>
+    </w:p>
+    <w:p>
+      <w:pPr>
+        <w:ind w:left="288" w:hanging="288"/>
+      </w:pPr>
+      <w:r>
+        <w:t xml:space="preserve">4. Заполните </w:t>
+      </w:r>
+      <w:r>
+        <w:rPr>
+          <w:b/>
+        </w:rPr>
+        <w:t>«Название фотографии»</w:t>
+      </w:r>
+      <w:r>
+        <w:t xml:space="preserve">, </w:t>
+      </w:r>
+      <w:r>
+        <w:rPr>
+          <w:b/>
+        </w:rPr>
+        <w:t>«Описание изображения»</w:t>
+      </w:r>
+      <w:r>
+        <w:t xml:space="preserve"> и, при необходимости, </w:t>
+      </w:r>
+      <w:r>
+        <w:rPr>
+          <w:b/>
+        </w:rPr>
+        <w:t>«Короткая подпись»</w:t>
+      </w:r>
+      <w:r>
+        <w:t>. В описании кратко объясните, что изображено: оно помогает посетителям с экранным диктором.</w:t>
+      </w:r>
+    </w:p>
+    <w:p>
+      <w:pPr>
+        <w:ind w:left="288" w:hanging="288"/>
+      </w:pPr>
+      <w:r>
+        <w:t xml:space="preserve">5. Включите </w:t>
+      </w:r>
+      <w:r>
+        <w:rPr>
+          <w:b/>
+        </w:rPr>
+        <w:t>«Показывать в альбоме»</w:t>
+      </w:r>
+      <w:r>
+        <w:t xml:space="preserve"> и нажмите </w:t>
+      </w:r>
+      <w:r>
+        <w:rPr>
+          <w:b/>
+        </w:rPr>
+        <w:t>«Сохранить и опубликовать»</w:t>
+      </w:r>
+      <w:r>
+        <w:t>. Новая запись по умолчанию скрыта.</w:t>
+      </w:r>
+    </w:p>
+    <w:p>
+      <w:pPr>
+        <w:ind w:left="288" w:hanging="288"/>
+      </w:pPr>
+      <w:r>
+        <w:t>6. На сайте откройте снимок крупно и проверьте подпись, порядок и отображение на телефоне.</w:t>
+      </w:r>
+    </w:p>
+    <w:p>
+      <w:pPr>
+        <w:pStyle w:val="Heading2"/>
+      </w:pPr>
+      <w:r>
+        <w:t>Подготовка снимков</w:t>
+      </w:r>
+    </w:p>
+    <w:p>
+      <w:r>
+        <w:t>Поддерживаются JPG, PNG и WebP. При загрузке браузер сам создаёт WebP-копию до 2048 пикселей по длинной стороне и до 2 МБ. Оригинал на вашем устройстве остаётся прежним. HEIC с телефона сначала экспортируйте в JPG. Для очень большого снимка подготовьте копию до 32 МБ и 32 мегапикселей.</w:t>
+      </w:r>
+    </w:p>
+    <w:p>
+      <w:pPr>
+        <w:pStyle w:val="Heading2"/>
+      </w:pPr>
+      <w:r>
+        <w:t>Порядок и скрытие</w:t>
+      </w:r>
+    </w:p>
+    <w:p>
+      <w:r>
+        <w:t xml:space="preserve">Меняйте порядок стрелками вверх и вниз возле записи. Чтобы временно скрыть снимок, выключите </w:t>
+      </w:r>
+      <w:r>
+        <w:rPr>
+          <w:b/>
+        </w:rPr>
+        <w:t>«Показывать в альбоме»</w:t>
+      </w:r>
+      <w:r>
+        <w:t xml:space="preserve"> и сохраните форму. Для удаления записи нажмите её корзину и сохраните. Альбом поддерживает до 60 записей; пустой список остаётся пустым.</w:t>
+      </w:r>
+    </w:p>
+    <w:p>
+      <w:r>
+        <w:t>В этом же разделе меняются название и вступление альбома, необязательная HTTPS-ссылка на полный альбом, заголовок карты и текст пейзажа перед контактами. Очистите ссылку на полный альбом, если она не нужна. Удаление записи альбома не удаляет сам файл из библиотеки.</w:t>
+      </w:r>
+    </w:p>
+    <w:p>
+      <w:r>
+        <w:br w:type="page"/>
+      </w:r>
+    </w:p>
+    <w:p>
+      <w:pPr>
+        <w:pStyle w:val="Heading1"/>
+      </w:pPr>
+      <w:r>
+        <w:t>4 Документы и библиотека файлов</w:t>
+      </w:r>
+    </w:p>
+    <w:p>
+      <w:pPr>
+        <w:pStyle w:val="Heading2"/>
+      </w:pPr>
+      <w:r>
+        <w:t>Опубликовать документ</w:t>
+      </w:r>
+    </w:p>
+    <w:p>
+      <w:pPr>
+        <w:ind w:left="288" w:hanging="288"/>
+      </w:pPr>
+      <w:r>
+        <w:t xml:space="preserve">1. Откройте </w:t>
+      </w:r>
+      <w:r>
+        <w:rPr>
+          <w:b/>
+        </w:rPr>
+        <w:t>«Документы»</w:t>
+      </w:r>
+      <w:r>
+        <w:t xml:space="preserve"> и нажмите </w:t>
+      </w:r>
+      <w:r>
+        <w:rPr>
+          <w:b/>
+        </w:rPr>
+        <w:t>«Добавить запись»</w:t>
+      </w:r>
+      <w:r>
+        <w:t xml:space="preserve"> либо раскройте нужную карточку.</w:t>
+      </w:r>
+    </w:p>
+    <w:p>
+      <w:pPr>
+        <w:ind w:left="288" w:hanging="288"/>
+      </w:pPr>
+      <w:r>
+        <w:t xml:space="preserve">2. Заполните название, категорию и описание. В поле </w:t>
+      </w:r>
+      <w:r>
+        <w:rPr>
+          <w:b/>
+        </w:rPr>
+        <w:t>«Загрузить или выбрать файл»</w:t>
+      </w:r>
+      <w:r>
+        <w:t xml:space="preserve"> нажмите </w:t>
+      </w:r>
+      <w:r>
+        <w:rPr>
+          <w:b/>
+        </w:rPr>
+        <w:t>«Загрузить файл»</w:t>
+      </w:r>
+      <w:r>
+        <w:t xml:space="preserve"> и выберите документ с устройства.</w:t>
+      </w:r>
+    </w:p>
+    <w:p>
+      <w:pPr>
+        <w:ind w:left="288" w:hanging="288"/>
+      </w:pPr>
+      <w:r>
+        <w:t xml:space="preserve">3. Дождитесь сообщения </w:t>
+      </w:r>
+      <w:r>
+        <w:rPr>
+          <w:b/>
+        </w:rPr>
+        <w:t>«Файл загружен»</w:t>
+      </w:r>
+      <w:r>
+        <w:t xml:space="preserve">. Путь к нему подставится в поле автоматически. Для существующего вложения используйте </w:t>
+      </w:r>
+      <w:r>
+        <w:rPr>
+          <w:b/>
+        </w:rPr>
+        <w:t>«Выбрать уже загруженный файл»</w:t>
+      </w:r>
+      <w:r>
+        <w:t>.</w:t>
+      </w:r>
+    </w:p>
+    <w:p>
+      <w:pPr>
+        <w:ind w:left="288" w:hanging="288"/>
+      </w:pPr>
+      <w:r>
+        <w:t xml:space="preserve">4. Включите </w:t>
+      </w:r>
+      <w:r>
+        <w:rPr>
+          <w:b/>
+        </w:rPr>
+        <w:t>«Показывать на сайте»</w:t>
+      </w:r>
+      <w:r>
+        <w:t xml:space="preserve">, затем нажмите </w:t>
+      </w:r>
+      <w:r>
+        <w:rPr>
+          <w:b/>
+        </w:rPr>
+        <w:t>«Сохранить и опубликовать»</w:t>
+      </w:r>
+      <w:r>
+        <w:t>.</w:t>
+      </w:r>
+    </w:p>
+    <w:p>
+      <w:pPr>
+        <w:ind w:left="288" w:hanging="288"/>
+      </w:pPr>
+      <w:r>
+        <w:t>5. Откройте публичную карточку, затем само вложение. Проверьте, что открывается нужная версия документа.</w:t>
+      </w:r>
+    </w:p>
+    <w:p>
+      <w:r>
+        <w:t xml:space="preserve">Поддерживаются PDF, Word, Excel, ODT, ODS, TXT и CSV </w:t>
+      </w:r>
+      <w:r>
+        <w:rPr>
+          <w:b/>
+        </w:rPr>
+        <w:t>до 20 МБ</w:t>
+      </w:r>
+      <w:r>
+        <w:t>. Содержимое документа при загрузке не сжимается и не изменяется. Если файл больше лимита, уменьшите его в исходной программе и выберите заново. Для чтения на телефоне обычно удобнее PDF.</w:t>
+      </w:r>
+    </w:p>
+    <w:p>
+      <w:pPr>
+        <w:pStyle w:val="Heading2"/>
+      </w:pPr>
+      <w:r>
+        <w:t>Загрузить заранее или заменить вложение</w:t>
+      </w:r>
+    </w:p>
+    <w:p>
+      <w:r>
+        <w:t xml:space="preserve">В разделе </w:t>
+      </w:r>
+      <w:r>
+        <w:rPr>
+          <w:b/>
+        </w:rPr>
+        <w:t>«Фотографии и файлы»</w:t>
+      </w:r>
+      <w:r>
+        <w:t xml:space="preserve"> выберите </w:t>
+      </w:r>
+      <w:r>
+        <w:rPr>
+          <w:b/>
+        </w:rPr>
+        <w:t>«Документы» → «Добавить документ»</w:t>
+      </w:r>
+      <w:r>
+        <w:t xml:space="preserve"> или </w:t>
+      </w:r>
+      <w:r>
+        <w:rPr>
+          <w:b/>
+        </w:rPr>
+        <w:t>«Фотографии» → «Добавить фотографию»</w:t>
+      </w:r>
+      <w:r>
+        <w:t>. После загрузки откройте нужную карточку, выберите файл из библиотеки и сохраните форму.</w:t>
+      </w:r>
+    </w:p>
+    <w:p>
+      <w:r>
+        <w:t xml:space="preserve">Загрузка в библиотеку сама по себе не создаёт публикацию. Для замены вложения в существующей карточке загрузите или выберите новый файл и сохраните. Кнопка </w:t>
+      </w:r>
+      <w:r>
+        <w:rPr>
+          <w:b/>
+        </w:rPr>
+        <w:t>«Убрать из записи»</w:t>
+      </w:r>
+      <w:r>
+        <w:t xml:space="preserve"> очищает только поле карточки.</w:t>
+      </w:r>
+    </w:p>
+    <w:p>
+      <w:pPr>
+        <w:pStyle w:val="Heading2"/>
+      </w:pPr>
+      <w:r>
+        <w:t>Корзина и восстановление</w:t>
+      </w:r>
+    </w:p>
+    <w:p>
+      <w:r>
+        <w:t xml:space="preserve">В библиотеке нажмите корзину возле файла и подтвердите </w:t>
+      </w:r>
+      <w:r>
+        <w:rPr>
+          <w:b/>
+        </w:rPr>
+        <w:t>«В корзину»</w:t>
+      </w:r>
+      <w:r>
+        <w:t xml:space="preserve">. Неиспользуемый файл уйдёт из публичной библиотеки. Для возврата раскройте </w:t>
+      </w:r>
+      <w:r>
+        <w:rPr>
+          <w:b/>
+        </w:rPr>
+        <w:t>«Корзина»</w:t>
+      </w:r>
+      <w:r>
+        <w:t xml:space="preserve"> и нажмите </w:t>
+      </w:r>
+      <w:r>
+        <w:rPr>
+          <w:b/>
+        </w:rPr>
+        <w:t>«Восстановить»</w:t>
+      </w:r>
+      <w:r>
+        <w:t>.</w:t>
+      </w:r>
+    </w:p>
+    <w:p>
+      <w:r>
+        <w:t>Файл, на который ссылается любая запись, включая черновик, удалить нельзя. Сначала уберите вложение из всех таких записей и сохраните соответствующие разделы. Встроенные PDF и DOCX этой инструкции защищены от удаления. Если восстановлению мешает одноимённый файл, обратитесь к владельцу; не заменяйте его наугад.</w:t>
+      </w:r>
+    </w:p>
+    <w:p>
+      <w:pPr>
+        <w:pStyle w:val="Heading2"/>
+      </w:pPr>
+      <w:r>
+        <w:t>Если загрузка не завершилась</w:t>
+      </w:r>
+    </w:p>
+    <w:p>
+      <w:r>
+        <w:t>Проверьте формат, размер и соединение. Если файл уже появился в библиотеке, используйте его вместо повторной загрузки. Если истёк вход, войдите заново. При повторной ошибке передайте владельцу её текст, тип и размер файла; пароль передавать не нужно.</w:t>
+      </w:r>
+    </w:p>
+    <w:p>
+      <w:r>
+        <w:rPr>
+          <w:b/>
+        </w:rPr>
+        <w:t>Загруженные файлы доступны по прямой ссылке даже у скрытых карточек.</w:t>
+      </w:r>
+      <w:r>
+        <w:t xml:space="preserve"> Не загружайте в публичную библиотеку пароли, закрытые персональные документы и другие материалы с ограниченным доступом.</w:t>
+      </w:r>
+    </w:p>
+    <w:p>
+      <w:r>
+        <w:br w:type="page"/>
+      </w:r>
+    </w:p>
+    <w:p>
+      <w:pPr>
+        <w:pStyle w:val="Heading1"/>
+      </w:pPr>
+      <w:r>
+        <w:t>5 Материалы для жителей</w:t>
+      </w:r>
+    </w:p>
+    <w:p>
+      <w:pPr>
+        <w:pStyle w:val="Heading2"/>
+      </w:pPr>
+      <w:r>
+        <w:t>Новости и объявления</w:t>
+      </w:r>
+    </w:p>
+    <w:p>
+      <w:r>
+        <w:t xml:space="preserve">Откройте раздел, нажмите </w:t>
+      </w:r>
+      <w:r>
+        <w:rPr>
+          <w:b/>
+        </w:rPr>
+        <w:t>«Добавить запись»</w:t>
+      </w:r>
+      <w:r>
+        <w:t xml:space="preserve">, заполните заголовок, дату, краткое описание и текст. При необходимости добавьте фотографию. Включите показ записи и нажмите </w:t>
+      </w:r>
+      <w:r>
+        <w:rPr>
+          <w:b/>
+        </w:rPr>
+        <w:t>«Сохранить и опубликовать»</w:t>
+      </w:r>
+      <w:r>
+        <w:t>. Проверьте карточку и полный текст на сайте.</w:t>
+      </w:r>
+    </w:p>
+    <w:p>
+      <w:r>
+        <w:t xml:space="preserve">Если запись пока не готова, оставьте выключенным </w:t>
+      </w:r>
+      <w:r>
+        <w:rPr>
+          <w:b/>
+        </w:rPr>
+        <w:t>«Показывать на сайте»</w:t>
+      </w:r>
+      <w:r>
+        <w:t xml:space="preserve"> и сохраните её. Она останется в редакторе как черновик. После включения показа и сохранения материал станет виден посетителям.</w:t>
+      </w:r>
+    </w:p>
+    <w:p>
+      <w:pPr>
+        <w:pStyle w:val="Heading2"/>
+      </w:pPr>
+      <w:r>
+        <w:t>Собрания и вопросы</w:t>
+      </w:r>
+    </w:p>
+    <w:p>
+      <w:r>
+        <w:t xml:space="preserve">В </w:t>
+      </w:r>
+      <w:r>
+        <w:rPr>
+          <w:b/>
+        </w:rPr>
+        <w:t>«Собрания»</w:t>
+      </w:r>
+      <w:r>
+        <w:t xml:space="preserve"> обновляйте дату, место, повестку и связанные документы. В </w:t>
+      </w:r>
+      <w:r>
+        <w:rPr>
+          <w:b/>
+        </w:rPr>
+        <w:t>«Вопросы и ответы»</w:t>
+      </w:r>
+      <w:r>
+        <w:t xml:space="preserve"> добавляйте вопрос и понятный ответ. Стрелки возле записей меняют их порядок. Скрытие и удаление применяются после сохранения формы.</w:t>
+      </w:r>
+    </w:p>
+    <w:p>
+      <w:pPr>
+        <w:pStyle w:val="Heading2"/>
+      </w:pPr>
+      <w:r>
+        <w:t>Контакты и правление</w:t>
+      </w:r>
+    </w:p>
+    <w:p>
+      <w:r>
+        <w:t xml:space="preserve">Укажите официальные телефон и почту, место и время приёма, состав правления и описание товарищества. Текст о товариществе также используется в блоке </w:t>
+      </w:r>
+      <w:r>
+        <w:rPr>
+          <w:b/>
+        </w:rPr>
+        <w:t>«Правление и собрания»</w:t>
+      </w:r>
+      <w:r>
+        <w:t xml:space="preserve">. После сохранения проверьте ссылки телефона и почты в </w:t>
+      </w:r>
+      <w:hyperlink r:id="rId14">
+        <w:r>
+          <w:rPr>
+            <w:color w:val="24534B"/>
+            <w:u w:val="single"/>
+          </w:rPr>
+          <w:t>Контактах</w:t>
+        </w:r>
+      </w:hyperlink>
+      <w:r>
+        <w:t>.</w:t>
+      </w:r>
+    </w:p>
+    <w:p>
+      <w:r>
+        <w:t>Владелец должен сверить эти сведения перед передачей сайта. Не заменяйте действующие контакты предположениями или тестовыми значениями.</w:t>
+      </w:r>
+    </w:p>
+    <w:p>
+      <w:pPr>
+        <w:pStyle w:val="Heading2"/>
+      </w:pPr>
+      <w:r>
+        <w:t>Взносы и реквизиты</w:t>
+      </w:r>
+    </w:p>
+    <w:p>
+      <w:r>
+        <w:t>Редактируйте реквизиты, назначение платежа, сведения о взносах и связанные документы по официальным данным правления. Перед включением показа перепроверьте получателя, ИНН, счета и БИК. Сайт показывает внесённые сведения, но не принимает платежи и не подтверждает оплату.</w:t>
+      </w:r>
+    </w:p>
+    <w:p>
+      <w:pPr>
+        <w:pStyle w:val="Heading2"/>
+      </w:pPr>
+      <w:r>
+        <w:t>Камеры</w:t>
+      </w:r>
+    </w:p>
+    <w:p>
+      <w:r>
+        <w:t>Камеры находятся в отдельном разделе; ссылка расположена внизу сайта. В редакторе меняются карточки и сведения о подключении. Постоянная онлайн-трансляция пока не подключена: карточка сама по себе не запускает видеопоток.</w:t>
+      </w:r>
+    </w:p>
+    <w:p>
+      <w:r>
+        <w:t>Параметры видеосервера согласуются отдельно. Не вставляйте в публичные поля логин камеры, пароль, RTSP-ссылку с паролем или секретный ключ. До проверки постоянного источника оставляйте поток отключённым.</w:t>
+      </w:r>
+    </w:p>
+    <w:p>
+      <w:pPr>
+        <w:pStyle w:val="Heading2"/>
+      </w:pPr>
+      <w:r>
+        <w:t>Что означает черновик</w:t>
+      </w:r>
+    </w:p>
+    <w:p>
+      <w:r>
+        <w:t>Выключенный показ скрывает карточку из обычного интерфейса сайта, но не делает данные секретными: сохранённые тексты и файлы хранятся в публичных материалах. Для конфиденциальной информации требуется отдельное закрытое хранилище.</w:t>
+      </w:r>
+    </w:p>
+    <w:p>
+      <w:r>
+        <w:br w:type="page"/>
+      </w:r>
+    </w:p>
+    <w:p>
+      <w:pPr>
+        <w:pStyle w:val="Heading1"/>
+      </w:pPr>
+      <w:r>
+        <w:t>6 Сохранение и восстановление</w:t>
+      </w:r>
+    </w:p>
+    <w:p>
+      <w:pPr>
+        <w:pStyle w:val="Heading2"/>
+      </w:pPr>
+      <w:r>
+        <w:t>Обычная проверка после правки</w:t>
+      </w:r>
+    </w:p>
+    <w:p>
+      <w:pPr>
+        <w:ind w:left="288" w:hanging="288"/>
+      </w:pPr>
+      <w:r>
+        <w:t>1. Убедитесь, что выбран правильный раздел и заполнены обязательные поля.</w:t>
+      </w:r>
+    </w:p>
+    <w:p>
+      <w:pPr>
+        <w:ind w:left="288" w:hanging="288"/>
+      </w:pPr>
+      <w:r>
+        <w:t xml:space="preserve">2. Нажмите </w:t>
+      </w:r>
+      <w:r>
+        <w:rPr>
+          <w:b/>
+        </w:rPr>
+        <w:t>«Сохранить и опубликовать»</w:t>
+      </w:r>
+      <w:r>
+        <w:t xml:space="preserve">. Дождитесь сообщения </w:t>
+      </w:r>
+      <w:r>
+        <w:rPr>
+          <w:b/>
+        </w:rPr>
+        <w:t>«Изменения опубликованы»</w:t>
+      </w:r>
+      <w:r>
+        <w:t>.</w:t>
+      </w:r>
+    </w:p>
+    <w:p>
+      <w:pPr>
+        <w:ind w:left="288" w:hanging="288"/>
+      </w:pPr>
+      <w:r>
+        <w:t xml:space="preserve">3. Откройте </w:t>
+      </w:r>
+      <w:r>
+        <w:rPr>
+          <w:b/>
+        </w:rPr>
+        <w:t>«Проверить на сайте»</w:t>
+      </w:r>
+      <w:r>
+        <w:t>, обновите страницу и проверьте именно изменённую запись. Для документа откройте вложение, для долга — нужный дом, для фотографии — крупный снимок.</w:t>
+      </w:r>
+    </w:p>
+    <w:p>
+      <w:r>
+        <w:t xml:space="preserve">Сохраняется весь открытый раздел. При переходе с несохранёнными правками админка предлагает </w:t>
+      </w:r>
+      <w:r>
+        <w:rPr>
+          <w:b/>
+        </w:rPr>
+        <w:t>«Остаться в форме»</w:t>
+      </w:r>
+      <w:r>
+        <w:t xml:space="preserve"> или </w:t>
+      </w:r>
+      <w:r>
+        <w:rPr>
+          <w:b/>
+        </w:rPr>
+        <w:t>«Продолжить без сохранения»</w:t>
+      </w:r>
+      <w:r>
+        <w:t>. Второй вариант отбрасывает введённые изменения.</w:t>
+      </w:r>
+    </w:p>
+    <w:p>
+      <w:pPr>
+        <w:pStyle w:val="Heading2"/>
+      </w:pPr>
+      <w:r>
+        <w:t>Если раздел изменили в другом окне</w:t>
+      </w:r>
+    </w:p>
+    <w:p>
+      <w:r>
+        <w:t xml:space="preserve">При конфликте появится сообщение, что раздел уже изменён. Ваши правки останутся в форме. Скопируйте нужный текст в отдельный документ, нажмите </w:t>
+      </w:r>
+      <w:r>
+        <w:rPr>
+          <w:b/>
+        </w:rPr>
+        <w:t>«Загрузить актуальную версию раздела»</w:t>
+      </w:r>
+      <w:r>
+        <w:t>, затем внесите правки поверх свежих данных и сохраните. Не обновляйте вкладку до копирования несохранённого текста.</w:t>
+      </w:r>
+    </w:p>
+    <w:p>
+      <w:r>
+        <w:t>Если пропало соединение или появилось сообщение об ошибке, не считайте сохранение завершённым. Проверьте публичный результат и актуальную версию раздела прежде, чем повторять действие.</w:t>
+      </w:r>
+    </w:p>
+    <w:p>
+      <w:pPr>
+        <w:pStyle w:val="Heading2"/>
+      </w:pPr>
+      <w:r>
+        <w:t>Скачать копию материалов</w:t>
+      </w:r>
+    </w:p>
+    <w:p>
+      <w:r>
+        <w:t xml:space="preserve">Кнопка </w:t>
+      </w:r>
+      <w:r>
+        <w:rPr>
+          <w:b/>
+        </w:rPr>
+        <w:t>«Скачать материалы»</w:t>
+      </w:r>
+      <w:r>
+        <w:t xml:space="preserve"> сохраняет JSON с содержимым девяти разделов и списком файлов. Это удобная копия текстов и настроек. </w:t>
+      </w:r>
+      <w:r>
+        <w:rPr>
+          <w:b/>
+        </w:rPr>
+        <w:t>Сами фотографии и документы в этот файл не входят</w:t>
+      </w:r>
+      <w:r>
+        <w:t xml:space="preserve"> — их нужно сохранить отдельно либо попросить владельца сделать полную резервную копию хостинга.</w:t>
+      </w:r>
+    </w:p>
+    <w:p>
+      <w:pPr>
+        <w:pStyle w:val="Heading2"/>
+      </w:pPr>
+      <w:r>
+        <w:t>Вернуть прежнюю версию</w:t>
+      </w:r>
+    </w:p>
+    <w:p>
+      <w:r>
+        <w:t>Перед успешным изменением раздела сервер сохраняет предыдущую версию в закрытую резервную папку. Кнопки отката текстов в редакторе нет. Передайте владельцу название раздела и примерное время нужной версии. Он сохранит текущие данные, выберет резервную копию и восстановит только согласованный раздел.</w:t>
+      </w:r>
+    </w:p>
+    <w:p>
+      <w:r>
+        <w:t xml:space="preserve">Удалённый файл можно вернуть самостоятельно через </w:t>
+      </w:r>
+      <w:r>
+        <w:rPr>
+          <w:b/>
+        </w:rPr>
+        <w:t>«Фотографии и файлы» → «Корзина» → «Восстановить»</w:t>
+      </w:r>
+      <w:r>
+        <w:t>. Для потерянного пароля обратитесь к владельцу хостинга: автоматического восстановления по почте здесь нет.</w:t>
+      </w:r>
+    </w:p>
+    <w:p>
+      <w:pPr>
+        <w:pStyle w:val="Heading2"/>
+      </w:pPr>
+      <w:r>
+        <w:t>Перед передачей редактору</w:t>
       </w:r>
     </w:p>
     <w:p>
@@ -87,13 +1481,7 @@
         <w:ind w:left="259" w:hanging="216"/>
       </w:pPr>
       <w:r>
-        <w:rPr>
-          <w:b/>
-        </w:rPr>
-        <w:t>Владелец</w:t>
-      </w:r>
-      <w:r>
-        <w:t xml:space="preserve"> входит через GitHub с доступом к проекту.</w:t>
+        <w:t>Проверьте вход по исправному HTTPS под отдельными данными управления.</w:t>
       </w:r>
     </w:p>
     <w:p>
@@ -102,13 +1490,7 @@
         <w:ind w:left="259" w:hanging="216"/>
       </w:pPr>
       <w:r>
-        <w:rPr>
-          <w:b/>
-        </w:rPr>
-        <w:t>Редактор</w:t>
-      </w:r>
-      <w:r>
-        <w:t xml:space="preserve"> входит с почтой, на которую получил персональное приглашение. Аккаунт GitHub ему не нужен.</w:t>
+        <w:t>Сверьте официальные контакты, реквизиты и текущие суммы задолженности.</w:t>
       </w:r>
     </w:p>
     <w:p>
@@ -117,972 +1499,7 @@
         <w:ind w:left="259" w:hanging="216"/>
       </w:pPr>
       <w:r>
-        <w:t>Если приглашения нет, запросите его у владельца. Ссылка на управление сама по себе не даёт права менять сайт.</w:t>
-      </w:r>
-    </w:p>
-    <w:p>
-      <w:r>
-        <w:t xml:space="preserve">Если требуется выбрать проект, укажите </w:t>
-      </w:r>
-      <w:r>
-        <w:rPr>
-          <w:b/>
-        </w:rPr>
-        <w:t>tim15071/prometey-demo</w:t>
-      </w:r>
-      <w:r>
-        <w:t xml:space="preserve">, ветку </w:t>
-      </w:r>
-      <w:r>
-        <w:rPr>
-          <w:b/>
-        </w:rPr>
-        <w:t>codex/demo</w:t>
-      </w:r>
-      <w:r>
-        <w:t>. Страница управления общедоступна; её поиск дома и кнопки проверки не сохраняют изменения. Кнопки редактирования открывают отдельную вкладку Pages CMS.</w:t>
-      </w:r>
-    </w:p>
-    <w:p>
-      <w:pPr>
-        <w:pStyle w:val="Heading2"/>
-      </w:pPr>
-      <w:r>
-        <w:t>С чего начать</w:t>
-      </w:r>
-    </w:p>
-    <w:p>
-      <w:pPr>
-        <w:ind w:left="288" w:hanging="288"/>
-      </w:pPr>
-      <w:r>
-        <w:t>1. Владелец выдаёт редактору персональный доступ. Приглашение заказчику пока не отправлено: почта будет предоставлена отдельно.</w:t>
-      </w:r>
-    </w:p>
-    <w:p>
-      <w:pPr>
-        <w:ind w:left="288" w:hanging="288"/>
-      </w:pPr>
-      <w:r>
-        <w:t xml:space="preserve">2. Заполните </w:t>
-      </w:r>
-      <w:r>
-        <w:rPr>
-          <w:b/>
-        </w:rPr>
-        <w:t>«Контакты и правление»</w:t>
-      </w:r>
-      <w:r>
-        <w:t>: телефон, почту, место и часы приёма, состав правления, описание товарищества.</w:t>
-      </w:r>
-    </w:p>
-    <w:p>
-      <w:pPr>
-        <w:ind w:left="288" w:hanging="288"/>
-      </w:pPr>
-      <w:r>
-        <w:t xml:space="preserve">3. Сверьте </w:t>
-      </w:r>
-      <w:r>
-        <w:rPr>
-          <w:b/>
-        </w:rPr>
-        <w:t>«Взносы и реквизиты»</w:t>
-      </w:r>
-      <w:r>
-        <w:t xml:space="preserve"> с официальными данными. Включайте показ реквизитов только после проверки.</w:t>
-      </w:r>
-    </w:p>
-    <w:p>
-      <w:pPr>
-        <w:ind w:left="288" w:hanging="288"/>
-      </w:pPr>
-      <w:r>
-        <w:t xml:space="preserve">4. Обновите нужные материалы, нажмите </w:t>
-      </w:r>
-      <w:r>
-        <w:rPr>
-          <w:b/>
-        </w:rPr>
-        <w:t>Save</w:t>
-      </w:r>
-      <w:r>
-        <w:t xml:space="preserve"> и проверьте результат после завершения публикации.</w:t>
-      </w:r>
-    </w:p>
-    <w:p>
-      <w:pPr>
-        <w:pStyle w:val="Heading2"/>
-      </w:pPr>
-      <w:r>
-        <w:t>Где искать нужную задачу</w:t>
-      </w:r>
-    </w:p>
-    <w:p>
-      <w:r>
-        <w:t xml:space="preserve">В редакторе девять разделов: </w:t>
-      </w:r>
-      <w:r>
-        <w:rPr>
-          <w:b/>
-        </w:rPr>
-        <w:t>Карта и задолженность</w:t>
-      </w:r>
-      <w:r>
-        <w:t xml:space="preserve">, </w:t>
-      </w:r>
-      <w:r>
-        <w:rPr>
-          <w:b/>
-        </w:rPr>
-        <w:t>Главная страница и фотоальбом</w:t>
-      </w:r>
-      <w:r>
-        <w:t xml:space="preserve">, </w:t>
-      </w:r>
-      <w:r>
-        <w:rPr>
-          <w:b/>
-        </w:rPr>
-        <w:t>Новости и объявления</w:t>
-      </w:r>
-      <w:r>
-        <w:t xml:space="preserve">, </w:t>
-      </w:r>
-      <w:r>
-        <w:rPr>
-          <w:b/>
-        </w:rPr>
-        <w:t>Документы</w:t>
-      </w:r>
-      <w:r>
-        <w:t xml:space="preserve">, </w:t>
-      </w:r>
-      <w:r>
-        <w:rPr>
-          <w:b/>
-        </w:rPr>
-        <w:t>Собрания</w:t>
-      </w:r>
-      <w:r>
-        <w:t xml:space="preserve">, </w:t>
-      </w:r>
-      <w:r>
-        <w:rPr>
-          <w:b/>
-        </w:rPr>
-        <w:t>Контакты и правление</w:t>
-      </w:r>
-      <w:r>
-        <w:t xml:space="preserve">, </w:t>
-      </w:r>
-      <w:r>
-        <w:rPr>
-          <w:b/>
-        </w:rPr>
-        <w:t>Взносы и реквизиты</w:t>
-      </w:r>
-      <w:r>
-        <w:t xml:space="preserve">, </w:t>
-      </w:r>
-      <w:r>
-        <w:rPr>
-          <w:b/>
-        </w:rPr>
-        <w:t>Вопросы и ответы</w:t>
-      </w:r>
-      <w:r>
-        <w:t xml:space="preserve">, </w:t>
-      </w:r>
-      <w:r>
-        <w:rPr>
-          <w:b/>
-        </w:rPr>
-        <w:t>Камеры</w:t>
-      </w:r>
-      <w:r>
-        <w:t>. Фотографии и файлы документов находятся в отдельных медиатеках.</w:t>
-      </w:r>
-    </w:p>
-    <w:p>
-      <w:r>
-        <w:br w:type="page"/>
-      </w:r>
-    </w:p>
-    <w:p>
-      <w:pPr>
-        <w:pStyle w:val="Heading1"/>
-      </w:pPr>
-      <w:r>
-        <w:t>2 Отметить задолженность на карте</w:t>
-      </w:r>
-    </w:p>
-    <w:p>
-      <w:pPr>
-        <w:pStyle w:val="Heading2"/>
-      </w:pPr>
-      <w:r>
-        <w:t>Добавить или изменить сумму</w:t>
-      </w:r>
-    </w:p>
-    <w:p>
-      <w:pPr>
-        <w:ind w:left="288" w:hanging="288"/>
-      </w:pPr>
-      <w:r>
-        <w:t xml:space="preserve">1. В управлении нажмите </w:t>
-      </w:r>
-      <w:r>
-        <w:rPr>
-          <w:b/>
-        </w:rPr>
-        <w:t>«Изменить задолженность»</w:t>
-      </w:r>
-      <w:r>
-        <w:t xml:space="preserve"> или откройте </w:t>
-      </w:r>
-      <w:r>
-        <w:rPr>
-          <w:b/>
-        </w:rPr>
-        <w:t>«Карта и задолженность»</w:t>
-      </w:r>
-      <w:r>
-        <w:t xml:space="preserve"> в CMS.</w:t>
-      </w:r>
-    </w:p>
-    <w:p>
-      <w:pPr>
-        <w:ind w:left="288" w:hanging="288"/>
-      </w:pPr>
-      <w:r>
-        <w:t xml:space="preserve">2. В группе </w:t>
-      </w:r>
-      <w:r>
-        <w:rPr>
-          <w:b/>
-        </w:rPr>
-        <w:t>«Задолженность»</w:t>
-      </w:r>
-      <w:r>
-        <w:t xml:space="preserve"> нажмите </w:t>
-      </w:r>
-      <w:r>
-        <w:rPr>
-          <w:b/>
-        </w:rPr>
-        <w:t>Add an item</w:t>
-      </w:r>
-      <w:r>
-        <w:t>. Для изменения существующего долга откройте его запись.</w:t>
-      </w:r>
-    </w:p>
-    <w:p>
-      <w:pPr>
-        <w:ind w:left="288" w:hanging="288"/>
-      </w:pPr>
-      <w:r>
-        <w:t xml:space="preserve">3. Выберите </w:t>
-      </w:r>
-      <w:r>
-        <w:rPr>
-          <w:b/>
-        </w:rPr>
-        <w:t>«Дом»</w:t>
-      </w:r>
-      <w:r>
-        <w:t>. Сверяйте полный номер: буква или «с1» обозначают отдельный вариант списка.</w:t>
-      </w:r>
-    </w:p>
-    <w:p>
-      <w:pPr>
-        <w:ind w:left="288" w:hanging="288"/>
-      </w:pPr>
-      <w:r>
-        <w:t xml:space="preserve">4. Введите </w:t>
-      </w:r>
-      <w:r>
-        <w:rPr>
-          <w:b/>
-        </w:rPr>
-        <w:t>«Сумма задолженности, ₽»</w:t>
-      </w:r>
-      <w:r>
-        <w:t xml:space="preserve">: положительное число, максимум два знака после десятичного разделителя. Например, </w:t>
-      </w:r>
-      <w:r>
-        <w:rPr>
-          <w:rFonts w:ascii="Consolas" w:hAnsi="Consolas"/>
-          <w:sz w:val="21"/>
-        </w:rPr>
-        <w:t>12500</w:t>
-      </w:r>
-      <w:r>
-        <w:t xml:space="preserve"> или </w:t>
-      </w:r>
-      <w:r>
-        <w:rPr>
-          <w:rFonts w:ascii="Consolas" w:hAnsi="Consolas"/>
-          <w:sz w:val="21"/>
-        </w:rPr>
-        <w:t>12500.50</w:t>
-      </w:r>
-      <w:r>
-        <w:t>. Это примеры формата, а не сведения о конкретном доме.</w:t>
-      </w:r>
-    </w:p>
-    <w:p>
-      <w:pPr>
-        <w:ind w:left="288" w:hanging="288"/>
-      </w:pPr>
-      <w:r>
-        <w:t xml:space="preserve">5. Проверьте дом и сумму. </w:t>
-      </w:r>
-      <w:r>
-        <w:rPr>
-          <w:b/>
-        </w:rPr>
-        <w:t>Один дом должен встречаться в списке один раз.</w:t>
-      </w:r>
-      <w:r>
-        <w:t xml:space="preserve"> Нажмите </w:t>
-      </w:r>
-      <w:r>
-        <w:rPr>
-          <w:b/>
-        </w:rPr>
-        <w:t>Save</w:t>
-      </w:r>
-      <w:r>
-        <w:t xml:space="preserve"> и дождитесь окончания сохранения.</w:t>
-      </w:r>
-    </w:p>
-    <w:p>
-      <w:r>
-        <w:t>Для задолженности нет отдельного выключателя публикации. Сохранённая запись с суммой включает красную отметку и показывает сумму всем посетителям. Приложение не рассчитывает долг и не сверяет оплату автоматически.</w:t>
-      </w:r>
-    </w:p>
-    <w:p>
-      <w:pPr>
-        <w:pStyle w:val="Heading2"/>
-      </w:pPr>
-      <w:r>
-        <w:t>Снять отметку после оплаты</w:t>
-      </w:r>
-    </w:p>
-    <w:p>
-      <w:r>
-        <w:t xml:space="preserve">Удалите всю запись нужного дома: корзина → </w:t>
-      </w:r>
-      <w:r>
-        <w:rPr>
-          <w:b/>
-        </w:rPr>
-        <w:t>Remove</w:t>
-      </w:r>
-      <w:r>
-        <w:t xml:space="preserve"> → </w:t>
-      </w:r>
-      <w:r>
-        <w:rPr>
-          <w:b/>
-        </w:rPr>
-        <w:t>Save</w:t>
-      </w:r>
-      <w:r>
-        <w:t>. Нулевую сумму вводить не нужно. После публикации проверьте, что красная отметка и сумма исчезли. Если меняли дом в записи, дополнительно проверьте прежний номер.</w:t>
-      </w:r>
-    </w:p>
-    <w:p>
-      <w:pPr>
-        <w:pStyle w:val="Heading2"/>
-      </w:pPr>
-      <w:r>
-        <w:t>Проверить результат</w:t>
-      </w:r>
-    </w:p>
-    <w:p>
-      <w:r>
-        <w:t xml:space="preserve">В управлении найдите дом по номеру и выберите его в </w:t>
-      </w:r>
-      <w:r>
-        <w:rPr>
-          <w:b/>
-        </w:rPr>
-        <w:t>«Дом на карте»</w:t>
-      </w:r>
-      <w:r>
-        <w:t xml:space="preserve">. Нажмите </w:t>
-      </w:r>
-      <w:r>
-        <w:rPr>
-          <w:b/>
-        </w:rPr>
-        <w:t>«Проверить публикацию»</w:t>
-      </w:r>
-      <w:r>
-        <w:t xml:space="preserve">, затем </w:t>
-      </w:r>
-      <w:r>
-        <w:rPr>
-          <w:b/>
-        </w:rPr>
-        <w:t>«Посмотреть на карте»</w:t>
-      </w:r>
-      <w:r>
-        <w:t>. Проверьте положение, полный номер и сумму. Ссылку на выбранный дом можно скопировать и открыть на телефоне.</w:t>
-      </w:r>
-    </w:p>
-    <w:p>
-      <w:r>
-        <w:t>Если обновление ещё не видно, дождитесь успешной публикации GitHub Pages и обновите страницу. Ошибка загрузки данных не подтверждает снятие задолженности. Не создавайте дубликаты записей для ускорения обновления.</w:t>
-      </w:r>
-    </w:p>
-    <w:p>
-      <w:pPr>
-        <w:pStyle w:val="Heading2"/>
-      </w:pPr>
-      <w:r>
-        <w:t>Если номера нет или он указан неверно</w:t>
-      </w:r>
-    </w:p>
-    <w:p>
-      <w:r>
-        <w:t xml:space="preserve">Не выбирайте соседний дом. Передайте владельцу точное положение и подтверждение номера. Группа </w:t>
-      </w:r>
-      <w:r>
-        <w:rPr>
-          <w:b/>
-        </w:rPr>
-        <w:t>«Уточнить или добавить номер»</w:t>
-      </w:r>
-      <w:r>
-        <w:t xml:space="preserve"> меняет подпись существующего контура, но не создаёт новое здание. После уточнения подпись в списке CMS может оставаться исходной: сверяйте положение на карте.</w:t>
-      </w:r>
-    </w:p>
-    <w:p>
-      <w:r>
-        <w:t>В реестре 205 зданий: 202 номера из OpenStreetMap и 3 уточнения по Яндекс Картам. Это контуры строений, а не кадастровые границы участков. Полная сверка всех номеров с Яндекс Картами не заявляется.</w:t>
-      </w:r>
-    </w:p>
-    <w:p>
-      <w:r>
-        <w:br w:type="page"/>
-      </w:r>
-    </w:p>
-    <w:p>
-      <w:pPr>
-        <w:pStyle w:val="Heading1"/>
-      </w:pPr>
-      <w:r>
-        <w:t>3 Изменить главную страницу и фотоальбом</w:t>
-      </w:r>
-    </w:p>
-    <w:p>
-      <w:r>
-        <w:t xml:space="preserve">Откройте </w:t>
-      </w:r>
-      <w:r>
-        <w:rPr>
-          <w:b/>
-        </w:rPr>
-        <w:t>«Главная страница и фотоальбом»</w:t>
-      </w:r>
-      <w:r>
-        <w:t xml:space="preserve">. После изменений в этом разделе нажмите </w:t>
-      </w:r>
-      <w:r>
-        <w:rPr>
-          <w:b/>
-        </w:rPr>
-        <w:t>Save</w:t>
-      </w:r>
-      <w:r>
-        <w:t xml:space="preserve"> один раз для сохранения всей формы.</w:t>
-      </w:r>
-    </w:p>
-    <w:p>
-      <w:pPr>
-        <w:pStyle w:val="Heading2"/>
-      </w:pPr>
-      <w:r>
-        <w:t>Тексты пролёта</w:t>
-      </w:r>
-    </w:p>
-    <w:p>
-      <w:r>
-        <w:t xml:space="preserve">В группе </w:t>
-      </w:r>
-      <w:r>
-        <w:rPr>
-          <w:b/>
-        </w:rPr>
-        <w:t>«Тексты пролёта»</w:t>
-      </w:r>
-      <w:r>
-        <w:t xml:space="preserve"> находятся три сцены. В каждой можно изменить надпись над заголовком, две строки заголовка и описание. На каждую строку заголовка допускается до 32 символов. Короткие фразы лучше читаются на телефоне; длинные описания проверьте поверх пейзажа.</w:t>
-      </w:r>
-    </w:p>
-    <w:p>
-      <w:r>
-        <w:t>Сам фильм, траектория и поведение пролёта при прокрутке остаются частью программного оформления. Замена текстов не изменяет движение камеры.</w:t>
-      </w:r>
-    </w:p>
-    <w:p>
-      <w:pPr>
-        <w:pStyle w:val="Heading2"/>
-      </w:pPr>
-      <w:r>
-        <w:t>Добавить фотографию</w:t>
-      </w:r>
-    </w:p>
-    <w:p>
-      <w:pPr>
-        <w:ind w:left="288" w:hanging="288"/>
-      </w:pPr>
-      <w:r>
-        <w:t xml:space="preserve">1. В группе </w:t>
-      </w:r>
-      <w:r>
-        <w:rPr>
-          <w:b/>
-        </w:rPr>
-        <w:t>«Фотоальбом» → «Фотографии и порядок»</w:t>
-      </w:r>
-      <w:r>
-        <w:t xml:space="preserve"> нажмите </w:t>
-      </w:r>
-      <w:r>
-        <w:rPr>
-          <w:b/>
-        </w:rPr>
-        <w:t>Add an item</w:t>
-      </w:r>
-      <w:r>
-        <w:t>.</w:t>
-      </w:r>
-    </w:p>
-    <w:p>
-      <w:pPr>
-        <w:ind w:left="288" w:hanging="288"/>
-      </w:pPr>
-      <w:r>
-        <w:t xml:space="preserve">2. Выберите готовую фотографию Прометея либо загрузите свою в поле </w:t>
-      </w:r>
-      <w:r>
-        <w:rPr>
-          <w:b/>
-        </w:rPr>
-        <w:t>«Загрузить свою фотографию»</w:t>
-      </w:r>
-      <w:r>
-        <w:t>. Если заполнены оба поля, используется загруженный файл.</w:t>
-      </w:r>
-    </w:p>
-    <w:p>
-      <w:pPr>
-        <w:ind w:left="288" w:hanging="288"/>
-      </w:pPr>
-      <w:r>
-        <w:t xml:space="preserve">3. Укажите </w:t>
-      </w:r>
-      <w:r>
-        <w:rPr>
-          <w:b/>
-        </w:rPr>
-        <w:t>«Название фотографии»</w:t>
-      </w:r>
-      <w:r>
-        <w:t xml:space="preserve">, </w:t>
-      </w:r>
-      <w:r>
-        <w:rPr>
-          <w:b/>
-        </w:rPr>
-        <w:t>«Описание изображения»</w:t>
-      </w:r>
-      <w:r>
-        <w:t xml:space="preserve"> и, при необходимости, </w:t>
-      </w:r>
-      <w:r>
-        <w:rPr>
-          <w:b/>
-        </w:rPr>
-        <w:t>«Короткая подпись»</w:t>
-      </w:r>
-      <w:r>
-        <w:t>. Описание изображения объясняет, что на снимке, в том числе посетителю с экранным диктором.</w:t>
-      </w:r>
-    </w:p>
-    <w:p>
-      <w:pPr>
-        <w:ind w:left="288" w:hanging="288"/>
-      </w:pPr>
-      <w:r>
-        <w:t xml:space="preserve">4. Включите </w:t>
-      </w:r>
-      <w:r>
-        <w:rPr>
-          <w:b/>
-        </w:rPr>
-        <w:t>«Показывать в альбоме»</w:t>
-      </w:r>
-      <w:r>
-        <w:t xml:space="preserve"> и нажмите </w:t>
-      </w:r>
-      <w:r>
-        <w:rPr>
-          <w:b/>
-        </w:rPr>
-        <w:t>Save</w:t>
-      </w:r>
-      <w:r>
-        <w:t>. Новая запись по умолчанию скрыта.</w:t>
-      </w:r>
-    </w:p>
-    <w:p>
-      <w:pPr>
-        <w:ind w:left="288" w:hanging="288"/>
-      </w:pPr>
-      <w:r>
-        <w:t>5. После публикации откройте фотографию на сайте. Проверьте подпись, крупное изображение и вид на телефоне.</w:t>
-      </w:r>
-    </w:p>
-    <w:p>
-      <w:r>
-        <w:t>Подойдут JPG, PNG или WebP. Рекомендуется ширина 1600–2400 пикселей и размер до 2 МБ. Альбом поддерживает до 60 записей. Перетаскивайте записи, чтобы менять их порядок.</w:t>
-      </w:r>
-    </w:p>
-    <w:p>
-      <w:pPr>
-        <w:pStyle w:val="Heading2"/>
-      </w:pPr>
-      <w:r>
-        <w:t>Убрать снимок или изменить подписи блоков</w:t>
-      </w:r>
-    </w:p>
-    <w:p>
-      <w:r>
-        <w:t xml:space="preserve">Выключите </w:t>
-      </w:r>
-      <w:r>
-        <w:rPr>
-          <w:b/>
-        </w:rPr>
-        <w:t>«Показывать в альбоме»</w:t>
-      </w:r>
-      <w:r>
-        <w:t xml:space="preserve">, чтобы скрыть снимок. Для удаления записи используйте корзину → </w:t>
-      </w:r>
-      <w:r>
-        <w:rPr>
-          <w:b/>
-        </w:rPr>
-        <w:t>Remove</w:t>
-      </w:r>
-      <w:r>
-        <w:t xml:space="preserve"> → </w:t>
-      </w:r>
-      <w:r>
-        <w:rPr>
-          <w:b/>
-        </w:rPr>
-        <w:t>Save</w:t>
-      </w:r>
-      <w:r>
-        <w:t>. Если удалить все записи, альбом останется пустым. Сам загруженный файл удаляется отдельно в медиатеке.</w:t>
-      </w:r>
-    </w:p>
-    <w:p>
-      <w:r>
-        <w:t>В этом же разделе редактируются заголовок и вступление альбома, HTTPS-ссылка на полный альбом, заголовок карты домов и текст пейзажа перед контактами. Очистите ссылку на полный альбом, чтобы скрыть её. Геометрия карты, шрифты и устройство страниц изменяются разработчиком.</w:t>
-      </w:r>
-    </w:p>
-    <w:p>
-      <w:r>
-        <w:br w:type="page"/>
-      </w:r>
-    </w:p>
-    <w:p>
-      <w:pPr>
-        <w:pStyle w:val="Heading1"/>
-      </w:pPr>
-      <w:r>
-        <w:t>4 Обновить материалы для жителей</w:t>
-      </w:r>
-    </w:p>
-    <w:p>
-      <w:pPr>
-        <w:pStyle w:val="Heading2"/>
-      </w:pPr>
-      <w:r>
-        <w:t>Новости и объявления</w:t>
-      </w:r>
-    </w:p>
-    <w:p>
-      <w:r>
-        <w:t xml:space="preserve">Нажмите </w:t>
-      </w:r>
-      <w:r>
-        <w:rPr>
-          <w:b/>
-        </w:rPr>
-        <w:t>Add an item</w:t>
-      </w:r>
-      <w:r>
-        <w:t xml:space="preserve">, заполните заголовок, дату и текст. При необходимости добавьте фотографию обложки и включите </w:t>
-      </w:r>
-      <w:r>
-        <w:rPr>
-          <w:b/>
-        </w:rPr>
-        <w:t>«Важное — показывать первым»</w:t>
-      </w:r>
-      <w:r>
-        <w:t xml:space="preserve">. Для публикации включите </w:t>
-      </w:r>
-      <w:r>
-        <w:rPr>
-          <w:b/>
-        </w:rPr>
-        <w:t>«Показывать на сайте»</w:t>
-      </w:r>
-      <w:r>
-        <w:t xml:space="preserve">, затем </w:t>
-      </w:r>
-      <w:r>
-        <w:rPr>
-          <w:b/>
-        </w:rPr>
-        <w:t>Save</w:t>
-      </w:r>
-      <w:r>
-        <w:t>.</w:t>
-      </w:r>
-    </w:p>
-    <w:p>
-      <w:r>
-        <w:t>Выключенный показ позволяет сохранить черновик. Чтобы убрать опубликованную новость из ленты, выключите этот же переключатель и сохраните. Черновики хранятся в публичном проекте и не предназначены для закрытой переписки.</w:t>
-      </w:r>
-    </w:p>
-    <w:p>
-      <w:pPr>
-        <w:pStyle w:val="Heading2"/>
-      </w:pPr>
-      <w:r>
-        <w:t>Документы и вложения</w:t>
-      </w:r>
-    </w:p>
-    <w:p>
-      <w:pPr>
-        <w:ind w:left="288" w:hanging="288"/>
-      </w:pPr>
-      <w:r>
-        <w:t xml:space="preserve">1. В </w:t>
-      </w:r>
-      <w:r>
-        <w:rPr>
-          <w:b/>
-        </w:rPr>
-        <w:t>«Документы»</w:t>
-      </w:r>
-      <w:r>
-        <w:t xml:space="preserve"> добавьте запись, укажите название, категорию, дату и пояснение.</w:t>
-      </w:r>
-    </w:p>
-    <w:p>
-      <w:pPr>
-        <w:ind w:left="288" w:hanging="288"/>
-      </w:pPr>
-      <w:r>
-        <w:t xml:space="preserve">2. В поле </w:t>
-      </w:r>
-      <w:r>
-        <w:rPr>
-          <w:b/>
-        </w:rPr>
-        <w:t>«Загрузить или выбрать файл»</w:t>
-      </w:r>
-      <w:r>
-        <w:t xml:space="preserve"> выберите существующее вложение либо загрузите новое с компьютера. Подойдут PDF, Word и таблицы; рекомендуемый размер до 10 МБ.</w:t>
-      </w:r>
-    </w:p>
-    <w:p>
-      <w:pPr>
-        <w:ind w:left="288" w:hanging="288"/>
-      </w:pPr>
-      <w:r>
-        <w:t xml:space="preserve">3. Включите </w:t>
-      </w:r>
-      <w:r>
-        <w:rPr>
-          <w:b/>
-        </w:rPr>
-        <w:t>«Показывать на сайте»</w:t>
-      </w:r>
-      <w:r>
-        <w:t xml:space="preserve">, нажмите </w:t>
-      </w:r>
-      <w:r>
-        <w:rPr>
-          <w:b/>
-        </w:rPr>
-        <w:t>Save</w:t>
-      </w:r>
-      <w:r>
-        <w:t>. На сайте откройте документ и убедитесь, что скачивается нужная версия.</w:t>
-      </w:r>
-    </w:p>
-    <w:p>
-      <w:r>
-        <w:t>Категории: «Устав», «Собрания», «Финансы», «Бланки», «Другое». Переименование карточки не заменяет файл: при обновлении документа выберите новое вложение явно.</w:t>
-      </w:r>
-    </w:p>
-    <w:p>
-      <w:pPr>
-        <w:pStyle w:val="Heading2"/>
-      </w:pPr>
-      <w:r>
-        <w:t>Контакты и правление</w:t>
-      </w:r>
-    </w:p>
-    <w:p>
-      <w:r>
-        <w:t xml:space="preserve">Измените адрес, телефон, почту, место и часы приёма, описание товарищества. В </w:t>
-      </w:r>
-      <w:r>
-        <w:rPr>
-          <w:b/>
-        </w:rPr>
-        <w:t>«Состав правления»</w:t>
-      </w:r>
-      <w:r>
-        <w:t xml:space="preserve"> задаются имя и должность. Описание товарищества выводится в блоке </w:t>
-      </w:r>
-      <w:r>
-        <w:rPr>
-          <w:b/>
-        </w:rPr>
-        <w:t>«Правление и собрания»</w:t>
-      </w:r>
-      <w:r>
-        <w:t>. Сохраните форму и проверьте разделы на сайте. Здесь нет отдельного выключателя публикации.</w:t>
-      </w:r>
-    </w:p>
-    <w:p>
-      <w:pPr>
-        <w:pStyle w:val="Heading2"/>
-      </w:pPr>
-      <w:r>
-        <w:t>Собрания вопросы и реквизиты</w:t>
-      </w:r>
-    </w:p>
-    <w:p>
-      <w:r>
-        <w:t xml:space="preserve">В </w:t>
-      </w:r>
-      <w:r>
-        <w:rPr>
-          <w:b/>
-        </w:rPr>
-        <w:t>«Собрания»</w:t>
-      </w:r>
-      <w:r>
-        <w:t xml:space="preserve"> задаются название, дата, время, место, повестка и видимость. В </w:t>
-      </w:r>
-      <w:r>
-        <w:rPr>
-          <w:b/>
-        </w:rPr>
-        <w:t>«Вопросы и ответы»</w:t>
-      </w:r>
-      <w:r>
-        <w:t xml:space="preserve"> редактируются текст, порядок и показ ответов. В </w:t>
-      </w:r>
-      <w:r>
-        <w:rPr>
-          <w:b/>
-        </w:rPr>
-        <w:t>«Взносы и реквизиты»</w:t>
-      </w:r>
-      <w:r>
-        <w:t xml:space="preserve"> — пояснения, сроки и банковские данные. Перед включением </w:t>
-      </w:r>
-      <w:r>
-        <w:rPr>
-          <w:b/>
-        </w:rPr>
-        <w:t>«Показывать реквизиты на сайте»</w:t>
-      </w:r>
-      <w:r>
-        <w:t xml:space="preserve"> сверьте получателя, ИНН, банк, БИК и расчётный счёт.</w:t>
-      </w:r>
-    </w:p>
-    <w:p>
-      <w:pPr>
-        <w:pStyle w:val="Heading2"/>
-      </w:pPr>
-      <w:r>
-        <w:t>Камеры</w:t>
-      </w:r>
-    </w:p>
-    <w:p>
-      <w:r>
-        <w:t>Раздел позволяет менять названия, описания, порядок и видимость карточек. Это не запускает видеотрансляцию. Постоянный источник видео пока не подключён; его настройка и авторизация жителей выполняются отдельно. Оставляйте поле потока пустым до согласованного подключения. Пароли, RTSP-ссылки с паролями и облачные ключи в CMS не добавляются.</w:t>
-      </w:r>
-    </w:p>
-    <w:p>
-      <w:r>
-        <w:br w:type="page"/>
-      </w:r>
-    </w:p>
-    <w:p>
-      <w:pPr>
-        <w:pStyle w:val="Heading1"/>
-      </w:pPr>
-      <w:r>
-        <w:t>5 Проверить публикацию и сохранить копию</w:t>
-      </w:r>
-    </w:p>
-    <w:p>
-      <w:pPr>
-        <w:pStyle w:val="Heading2"/>
-      </w:pPr>
-      <w:r>
-        <w:t>После каждого сохранения</w:t>
-      </w:r>
-    </w:p>
-    <w:p>
-      <w:r>
-        <w:rPr>
-          <w:b/>
-        </w:rPr>
-        <w:t>Save</w:t>
-      </w:r>
-      <w:r>
-        <w:t xml:space="preserve"> сохраняет материалы в проекте GitHub. Сайт получает новую версию после успешного завершения публикации GitHub Pages. Фиксированного времени ожидания нет: оно зависит от очереди сервиса. Затем обновите сайт и нажмите </w:t>
-      </w:r>
-      <w:r>
-        <w:rPr>
-          <w:b/>
-        </w:rPr>
-        <w:t>«Обновить данные»</w:t>
-      </w:r>
-      <w:r>
-        <w:t xml:space="preserve"> в управлении.</w:t>
-      </w:r>
-    </w:p>
-    <w:p>
-      <w:r>
-        <w:t>Проверьте конкретный результат: текст или фотографию, ссылку документа, дату новости, номер дома и сумму. Для окончательной проверки откройте страницу в другом браузере или на телефоне. Вход в редактор для просмотра публичного сайта не нужен.</w:t>
-      </w:r>
-    </w:p>
-    <w:p>
-      <w:pPr>
-        <w:pStyle w:val="Heading2"/>
-      </w:pPr>
-      <w:r>
-        <w:t>Если изменение не появилось</w:t>
+        <w:t>Сохраните реальную правку, затем проверьте её на сайте с телефона.</w:t>
       </w:r>
     </w:p>
     <w:p>
@@ -1091,16 +1508,7 @@
         <w:ind w:left="259" w:hanging="216"/>
       </w:pPr>
       <w:r>
-        <w:t xml:space="preserve">Повторно откройте запись в CMS и убедитесь, что она сохранилась. Проверьте проект и ветку </w:t>
-      </w:r>
-      <w:r>
-        <w:rPr>
-          <w:b/>
-        </w:rPr>
-        <w:t>codex/demo</w:t>
-      </w:r>
-      <w:r>
-        <w:t>.</w:t>
+        <w:t>Откройте опубликованные документы и фотографии.</w:t>
       </w:r>
     </w:p>
     <w:p>
@@ -1109,7 +1517,7 @@
         <w:ind w:left="259" w:hanging="216"/>
       </w:pPr>
       <w:r>
-        <w:t>Проверьте переключатель видимости, если он есть у этого типа записи.</w:t>
+        <w:t>Скачайте копию материалов и согласуйте с владельцем полное резервное копирование.</w:t>
       </w:r>
     </w:p>
     <w:p>
@@ -1118,180 +1526,40 @@
         <w:ind w:left="259" w:hanging="216"/>
       </w:pPr>
       <w:r>
-        <w:t xml:space="preserve">Владелец может проверить </w:t>
-      </w:r>
-      <w:hyperlink r:id="rId13">
+        <w:t xml:space="preserve">Завершите работу кнопкой </w:t>
+      </w:r>
+      <w:r>
+        <w:rPr>
+          <w:b/>
+        </w:rPr>
+        <w:t>«Выйти»</w:t>
+      </w:r>
+      <w:r>
+        <w:t>.</w:t>
+      </w:r>
+    </w:p>
+    <w:p>
+      <w:hyperlink r:id="rId15">
         <w:r>
           <w:rPr>
             <w:color w:val="24534B"/>
             <w:u w:val="single"/>
           </w:rPr>
-          <w:t>публикации GitHub Pages</w:t>
+          <w:t>Открыть сайт</w:t>
         </w:r>
       </w:hyperlink>
       <w:r>
-        <w:t>. Если публикация завершилась ошибкой, передайте ему время изменения и название раздела.</w:t>
-      </w:r>
-    </w:p>
-    <w:p>
-      <w:pPr>
-        <w:pStyle w:val="ListBullet"/>
-        <w:ind w:left="259" w:hanging="216"/>
-      </w:pPr>
-      <w:r>
-        <w:t xml:space="preserve">Если CMS не принимает данные, проверьте обязательные поля и ограничения. Если после сохранения следующее изменение не активировало </w:t>
-      </w:r>
-      <w:r>
-        <w:rPr>
-          <w:b/>
-        </w:rPr>
-        <w:t>Save</w:t>
-      </w:r>
-      <w:r>
-        <w:t>, обновите форму и повторите действие. Несохранённый текст предварительно скопируйте.</w:t>
-      </w:r>
-    </w:p>
-    <w:p>
-      <w:pPr>
-        <w:pStyle w:val="Heading2"/>
-      </w:pPr>
-      <w:r>
-        <w:t>Резервная копия и восстановление</w:t>
-      </w:r>
-    </w:p>
-    <w:p>
-      <w:r>
-        <w:t xml:space="preserve">В управлении откройте </w:t>
-      </w:r>
-      <w:r>
-        <w:rPr>
-          <w:b/>
-        </w:rPr>
-        <w:t>«Резервная копия»</w:t>
-      </w:r>
-      <w:r>
-        <w:t xml:space="preserve">. </w:t>
-      </w:r>
-      <w:r>
-        <w:rPr>
-          <w:b/>
-        </w:rPr>
-        <w:t>«Скачать тексты и настройки»</w:t>
-      </w:r>
-      <w:r>
-        <w:t xml:space="preserve"> выгружает JSON всех девяти разделов, включая скрытые записи. Архив по соседней ссылке содержит также фотографии и документы. Упакованная демоверсия не заменяет отдельный комплект размещения на SpaceWeb.</w:t>
-      </w:r>
-    </w:p>
-    <w:p>
-      <w:r>
-        <w:t>Сохраняйте копию перед крупными изменениями. Импорта JSON одной кнопкой нет. Для восстановления передайте владельцу копию и название нужного раздела; владелец восстанавливает материалы через репозиторий. Не заменяйте весь проект старой копией, если после неё другие редакторы внесли изменения.</w:t>
-      </w:r>
-    </w:p>
-    <w:p>
-      <w:pPr>
-        <w:pStyle w:val="Heading2"/>
-      </w:pPr>
-      <w:r>
-        <w:t>Доступ и удаление материалов</w:t>
-      </w:r>
-    </w:p>
-    <w:p>
-      <w:r>
-        <w:t xml:space="preserve">Владелец входит в Pages CMS через GitHub и открывает </w:t>
-      </w:r>
-      <w:r>
-        <w:rPr>
-          <w:b/>
-        </w:rPr>
-        <w:t>Collaborators → Invite a collaborator</w:t>
-      </w:r>
-      <w:r>
-        <w:t xml:space="preserve">. Он указывает почту, отправляет приглашение, а редактор принимает его. Для отзыва доступа владелец удаляет редактора в </w:t>
-      </w:r>
-      <w:r>
-        <w:rPr>
-          <w:b/>
-        </w:rPr>
-        <w:t>Collaborators</w:t>
-      </w:r>
-      <w:r>
-        <w:t>. У каждого редактора должен быть собственный вход.</w:t>
-      </w:r>
-    </w:p>
-    <w:p>
-      <w:r>
-        <w:t>Выключение показа не закрывает вложение по прямой ссылке. Чтобы убрать файл из текущей версии, удалите ссылки на него и затем сам файл в медиатеке. Прежние версии могут оставаться в истории публичного GitHub-проекта. Загружайте только материалы для открытого сайта.</w:t>
-      </w:r>
-    </w:p>
-    <w:p>
-      <w:pPr>
-        <w:pStyle w:val="Heading2"/>
-      </w:pPr>
-      <w:r>
-        <w:t>Адреса для работы</w:t>
-      </w:r>
-    </w:p>
-    <w:p>
+        <w:t xml:space="preserve"> · </w:t>
+      </w:r>
       <w:hyperlink r:id="rId11">
         <w:r>
           <w:rPr>
             <w:color w:val="24534B"/>
             <w:u w:val="single"/>
           </w:rPr>
-          <w:t>Управление</w:t>
+          <w:t>Открыть управление</w:t>
         </w:r>
       </w:hyperlink>
-      <w:r>
-        <w:t xml:space="preserve"> · </w:t>
-      </w:r>
-      <w:hyperlink r:id="rId14">
-        <w:r>
-          <w:rPr>
-            <w:color w:val="24534B"/>
-            <w:u w:val="single"/>
-          </w:rPr>
-          <w:t>Карта</w:t>
-        </w:r>
-      </w:hyperlink>
-      <w:r>
-        <w:t xml:space="preserve"> · </w:t>
-      </w:r>
-      <w:hyperlink r:id="rId12">
-        <w:r>
-          <w:rPr>
-            <w:color w:val="24534B"/>
-            <w:u w:val="single"/>
-          </w:rPr>
-          <w:t>Pages CMS</w:t>
-        </w:r>
-      </w:hyperlink>
-      <w:r>
-        <w:t xml:space="preserve"> · </w:t>
-      </w:r>
-      <w:hyperlink r:id="rId15">
-        <w:r>
-          <w:rPr>
-            <w:color w:val="24534B"/>
-            <w:u w:val="single"/>
-          </w:rPr>
-          <w:t>Правила доступа Pages CMS</w:t>
-        </w:r>
-      </w:hyperlink>
-    </w:p>
-    <w:p>
-      <w:r>
-        <w:t xml:space="preserve">После переноса управление будет доступно на домене заказчика по пути </w:t>
-      </w:r>
-      <w:r>
-        <w:rPr>
-          <w:rFonts w:ascii="Consolas" w:hAnsi="Consolas"/>
-          <w:sz w:val="21"/>
-        </w:rPr>
-        <w:t>/?page=manage</w:t>
-      </w:r>
-      <w:r>
-        <w:t>; редактор Pages CMS останется тем же. Текущую готовность домена и HTTPS уточняет владелец при передаче.</w:t>
-      </w:r>
     </w:p>
     <w:sectPr>
       <w:headerReference w:type="default" r:id="rId9"/>

</xml_diff>